<commit_message>
Manuscript: caption and cross-reference fixes
Co-Authored-By: Claude Sonnet 5.5 <noreply@anthropic.com>
</commit_message>
<xml_diff>
--- a/manuscript/Admissibility_Shear_Closures_IEEE_TPS.docx
+++ b/manuscript/Admissibility_Shear_Closures_IEEE_TPS.docx
@@ -5445,7 +5445,7 @@
         <w:rPr>
           <w:sz w:val="20"/>
         </w:rPr>
-        <w:t xml:space="preserve"> tested (Table IV). The smoothed closure of Eq. (3) removes the branching: Φ is a smooth functional of the profile through A, and (T, A) obey a closed system of two second-order equations with the conditions T(a) = T</w:t>
+        <w:t xml:space="preserve"> tested (Table S4 of the supplement). The smoothed closure of Eq. (3) removes the branching: Φ is a smooth functional of the profile through A, and (T, A) obey a closed system of two second-order equations with the conditions T(a) = T</w:t>
       </w:r>
       <w:r>
         <w:rPr>
@@ -7813,7 +7813,7 @@
           <w:smallCaps/>
           <w:sz w:val="16"/>
         </w:rPr>
-        <w:t>Smoothed closure (ℓ = 0.05 m, N = 200) at 40 MW: gain, core temperature, and benchmark quantities</w:t>
+        <w:t>Smoothed closure (ℓ = 0.05 m, N = 400) at 40 MW: gain, core temperature, and benchmark quantities</w:t>
       </w:r>
     </w:p>
     <w:tbl>

</xml_diff>

<commit_message>
v1.1.1: qualify well-posedness as numerical, describe gain law as empirical fit, calibration caveat, compact-tokamak discussion, new title
Co-Authored-By: Claude Sonnet 5.5 <noreply@anthropic.com>
</commit_message>
<xml_diff>
--- a/manuscript/Admissibility_Shear_Closures_IEEE_TPS.docx
+++ b/manuscript/Admissibility_Shear_Closures_IEEE_TPS.docx
@@ -12,7 +12,7 @@
           <w:rFonts w:ascii="Times New Roman" w:hAnsi="Times New Roman"/>
           <w:sz w:val="44"/>
         </w:rPr>
-        <w:t>Well-Posed Shear-Suppression Closures for Reduced Tokamak Transport: Admissibility, Regularization, and Physical Calibration</w:t>
+        <w:t>Numerical Admissibility and Regularization of Shear-Suppression Closures for Reduced Tokamak Transport</w:t>
       </w:r>
     </w:p>
     <w:p>
@@ -62,7 +62,7 @@
           <w:b/>
           <w:sz w:val="18"/>
         </w:rPr>
-        <w:t>Closures in which turbulent heat transport is suppressed by sheared plasma flow make the transport coefficient depend on the evolving profile, yet the conditions under which they define a solvable problem are rarely examined. This paper studies such closures in a reduced model of a reactor-scale tokamak, with a one-dimensional radial energy balance, fusion heating, and a toroidal-rotation equation, so that only the closure changes between runs. The local closure, whose shearing rate contains the second derivative of the temperature, is shown to be ill posed: its steady state depends on how the edge is treated, and a grid-scale instability appears at a threshold that grows as the square root of the number of cells. A closure that smooths the shearing rate over a fixed length is well posed; its fusion gain converges at second order and follows an inverse-square law in the suppression threshold. For momentum transport, a steady flux relation gives closed-form conditions under which a shear-dependent viscosity admits a steady rotation profile and predicts its saturation, fold, and hysteresis, which direct solutions reproduce to ten digits. The baseline reproduces an L-mode confinement scaling, the smoothed closure raises the fusion gain by 0.6% at a threshold of 0.3 and by 6% at 0.1, and neutral-beam torque of reactor size adds about 1.5%. Parameter uncertainty is quantified. No experimental data are used.</w:t>
+        <w:t>Closures in which turbulent heat transport is suppressed by sheared plasma flow make the transport coefficient depend on the evolving profile, yet the conditions under which they define a solvable problem are rarely examined. This paper studies such closures in a reduced model of a reactor-scale tokamak, with a one-dimensional radial energy balance, fusion heating, and a toroidal-rotation equation, so that only the closure changes between runs. The local closure, whose shearing rate contains the second derivative of the temperature, is found numerically to be ill posed: its steady state depends on how the edge is treated, and a grid-scale instability appears at a threshold that grows as the square root of the number of cells. A closure that smooths the shearing rate over a fixed length is stable and grid converged over the tested conditions; its fusion gain converges at second order and is fitted by an inverse-square relation in the suppression threshold. For momentum transport, a steady flux relation gives closed-form conditions under which a shear-dependent viscosity admits a steady rotation profile and predicts its saturation, fold, and hysteresis, which direct solutions reproduce to ten digits. The baseline, with its edge temperature imposed, is consistent with an L-mode scaling (a check, not a validation), the smoothed closure raises the fusion gain by 0.6% at a threshold of 0.3 and by 6% at 0.1, and neutral-beam torque of reactor size adds about 1.5%. Parameter uncertainty is quantified. No experimental data are used.</w:t>
       </w:r>
     </w:p>
     <w:p>
@@ -133,7 +133,7 @@
         <w:rPr>
           <w:sz w:val="20"/>
         </w:rPr>
-        <w:t>Whether such a closure defines a well-posed steady problem, and how much it changes the fusion gain under controlled conditions, are separate questions that are seldom answered together. This paper makes four contributions.</w:t>
+        <w:t>Whether such a closure defines a well-behaved steady problem, and how much it changes the fusion gain under controlled conditions, are separate questions that are seldom answered together. This paper makes four contributions.</w:t>
       </w:r>
     </w:p>
     <w:p>
@@ -159,7 +159,7 @@
         <w:rPr>
           <w:sz w:val="20"/>
         </w:rPr>
-        <w:t>2)  A diagnosis of the local heat closure: because the shearing rate contains the second derivative of the temperature, the steady problem is ill posed, and a smoothed (adaptive-field) closure with a fixed length restores well-posedness (Sections III-B and V-A).</w:t>
+        <w:t>2)  A diagnosis of the local heat closure: because the shearing rate contains the second derivative of the temperature, the steady problem is numerically ill posed, and a smoothed (adaptive-field) closure with a fixed length restores numerical stability and convergence over the tested conditions (Sections III-B and V-A).</w:t>
       </w:r>
     </w:p>
     <w:p>
@@ -172,7 +172,7 @@
         <w:rPr>
           <w:sz w:val="20"/>
         </w:rPr>
-        <w:t>3)  A controlled, verified comparison in which only the closure differs, with grid-converged results, a gain law, a torque-driven extension, and a parameter-uncertainty study (Sections V-B to V-E).</w:t>
+        <w:t>3)  A controlled, verified comparison in which only the closure differs, with grid-converged results, a fitted gain relation, a torque-driven extension, and a parameter-uncertainty study (Sections V-B to V-E).</w:t>
       </w:r>
     </w:p>
     <w:p>
@@ -198,7 +198,7 @@
         <w:rPr>
           <w:sz w:val="20"/>
         </w:rPr>
-        <w:t>Nothing is fitted to experiment, no new fluid equation is proposed, and the model describes no specific device; the results are statements about closures in a reduced model.</w:t>
+        <w:t>Nothing is fitted to experiment, no new fluid equation is proposed, and the model describes no specific device; the results are statements about closures in a reduced model. “Well posed” is used here in a numerical sense: the admissibility conditions of Section III are proved, but for the nonlinear heat problem existence, uniqueness, and continuous dependence are not, and the evidence is numerical (eigenvalues, convergence orders, edge-condition variants).</w:t>
       </w:r>
     </w:p>
     <w:p>
@@ -3854,7 +3854,7 @@
         <w:rPr>
           <w:sz w:val="20"/>
         </w:rPr>
-        <w:t>III. ADMISSIBILITY AND WELL-POSEDNESS</w:t>
+        <w:t>III. ADMISSIBILITY AND REGULARIZATION</w:t>
       </w:r>
     </w:p>
     <w:p>
@@ -6038,7 +6038,7 @@
         <w:rPr>
           <w:i/>
         </w:rPr>
-        <w:t>The Local Closure Is Ill Posed</w:t>
+        <w:t>The Local Closure Is Numerically Ill Posed</w:t>
       </w:r>
     </w:p>
     <w:p>
@@ -7669,7 +7669,7 @@
         <w:rPr>
           <w:sz w:val="20"/>
         </w:rPr>
-        <w:t xml:space="preserve"> tested. Table VI gives the comparison. The gain follows an inverse-square law, ΔQ = C/s</w:t>
+        <w:t xml:space="preserve"> tested. Table VI gives the comparison. The gain is described by a fitted inverse-square relation, ΔQ = C/s</w:t>
       </w:r>
       <w:r>
         <w:rPr>
@@ -7708,7 +7708,7 @@
         <w:rPr>
           <w:sz w:val="20"/>
         </w:rPr>
-        <w:t>²; the law holds within 12% over 0.02 ≤ s</w:t>
+        <w:t>²; the fit is within 12% over 0.02 ≤ s</w:t>
       </w:r>
       <w:r>
         <w:rPr>
@@ -7721,7 +7721,7 @@
         <w:rPr>
           <w:sz w:val="20"/>
         </w:rPr>
-        <w:t xml:space="preserve"> ≤ 1. The confinement time barely changes (τ</w:t>
+        <w:t xml:space="preserve"> ≤ 1 for this parameter set. It is an empirical relation for the tested range, not a derived or universal scaling law. The confinement time barely changes (τ</w:t>
       </w:r>
       <w:r>
         <w:rPr>
@@ -9210,7 +9210,7 @@
         <w:rPr>
           <w:sz w:val="16"/>
         </w:rPr>
-        <w:t xml:space="preserve"> with the inverse-square law (dashed) and the 5–95 % interval from the parameter-uncertainty study (bars). (b) Convergence of Q with N (dotted: N</w:t>
+        <w:t xml:space="preserve"> with the fitted inverse-square relation (dashed) and the 5–95 % interval from the parameter-uncertainty study (bars). (b) Convergence of Q with N (dotted: N</w:t>
       </w:r>
       <w:r>
         <w:rPr>
@@ -10586,7 +10586,20 @@
         <w:rPr>
           <w:sz w:val="20"/>
         </w:rPr>
-        <w:t>, the baseline confinement time 1.84 s is 1.01 times the ITER89-P L-mode scaling [14] (1.81 s) and 0.48 times the IPB98(y,2) H-mode scaling [15] (3.85 s). The stiff baseline with a fixed 4 keV edge is therefore an L-mode-like plasma. The smoothed closure acts only on the edge shear, and even at s</w:t>
+        <w:t>, the baseline confinement time 1.84 s is 1.01 times the ITER89-P L-mode scaling [14] (1.81 s) and 0.48 times the IPB98(y,2) H-mode scaling [15] (3.85 s). The stiff baseline with a fixed 4 keV edge is therefore an L-mode-like plasma. The agreement with ITER89-P is a consistency check, not an independent validation: the edge temperature is imposed, the critical-gradient parameters are generic, and the density and heating profiles are prescribed, so other parameter choices would also bring H</w:t>
+      </w:r>
+      <w:r>
+        <w:rPr>
+          <w:sz w:val="20"/>
+          <w:vertAlign w:val="subscript"/>
+        </w:rPr>
+        <w:t>89</w:t>
+      </w:r>
+      <w:r>
+        <w:rPr>
+          <w:sz w:val="20"/>
+        </w:rPr>
+        <w:t xml:space="preserve"> near unity. The smoothed closure acts only on the edge shear, and even at s</w:t>
       </w:r>
       <w:r>
         <w:rPr>
@@ -11043,7 +11056,7 @@
         <w:rPr>
           <w:sz w:val="20"/>
         </w:rPr>
-        <w:t xml:space="preserve"> ≲ 0.07. Which regime applies cannot be decided without gyrokinetic growth rates for the profiles in question, and that calibration, together with ℓ, is the main open step. Meanwhile the gain law ΔQ/Q = 0.056%/s</w:t>
+        <w:t xml:space="preserve"> ≲ 0.07. Which regime applies cannot be decided without gyrokinetic growth rates for the profiles in question, and that calibration, together with ℓ, is the main open step. Meanwhile the fitted relation ΔQ/Q = 0.056%/s</w:t>
       </w:r>
       <w:r>
         <w:rPr>
@@ -11056,7 +11069,7 @@
         <w:rPr>
           <w:sz w:val="20"/>
         </w:rPr>
-        <w:t>² and its uncertainty band give the sensitivity of the result to the choice.</w:t>
+        <w:t>² (valid only for the tested range and parameters) and its uncertainty band give the sensitivity of the result to the choice.</w:t>
       </w:r>
     </w:p>
     <w:p>
@@ -11519,15 +11532,20 @@
     </w:p>
     <w:p>
       <w:pPr>
-        <w:spacing w:after="40"/>
-        <w:ind w:firstLine="245"/>
-        <w:jc w:val="both"/>
+        <w:keepNext/>
+        <w:spacing w:before="80" w:after="40"/>
       </w:pPr>
       <w:r>
         <w:rPr>
-          <w:sz w:val="20"/>
-        </w:rPr>
-        <w:t>Three findings stand out. First, the well-posedness of a shear-suppression closure is not a numerical detail: for the local closure the converged answer is set by an edge condition that the physics does not supply, and a consistent discretization is unstable at fine resolution. A local-closure result should therefore be reported with its edge treatment, resolution, and eigenvalues; the smoothed closure removes the issue at the price of one new length, to which the gain is insensitive (Table V). Second, the admissibility conditions are a priori checks that cost nothing and are reproduced to ten digits. Third, in this model the diamagnetic shear changes the gain by well under one per cent at moderate threshold, and the sensitivity to the threshold, not the form of the closure, dominates the uncertainty.</w:t>
+          <w:i/>
+        </w:rPr>
+        <w:t xml:space="preserve">A. </w:t>
+      </w:r>
+      <w:r>
+        <w:rPr>
+          <w:i/>
+        </w:rPr>
+        <w:t>Principal Findings</w:t>
       </w:r>
     </w:p>
     <w:p>
@@ -11540,7 +11558,38 @@
         <w:rPr>
           <w:sz w:val="20"/>
         </w:rPr>
-        <w:t>The limitations are those of a reduced model: one-dimensional energy transport with fixed density, equal temperatures, and local alpha deposition; one-way coupling to rotation; no pedestal, edge-localized-mode, or magnetohydrodynamic physics; generic critical-gradient parameters (benchmarked only at the level of Section VI); an uncalibrated threshold and length; and no experimental data. The plasma current, elongation, and the Troyon limit enter only the calibration. A predictive claim would require gyrokinetic calibration of s</w:t>
+        <w:t>Three findings stand out. First, whether a shear-suppression closure is well behaved is not a numerical detail: for the local closure the converged answer is set by an edge condition that the physics does not supply, and a consistent discretization is unstable at fine resolution. A local-closure result should therefore be reported with its edge treatment, resolution, and eigenvalues; the smoothed closure removes the issue at the price of one new length, to which the gain is insensitive (Table V). Second, the admissibility conditions are a priori checks that cost nothing and are reproduced to ten digits. Third, in this model the diamagnetic shear changes the gain by well under one per cent at moderate threshold, and the sensitivity to the threshold, not the form of the closure, dominates the uncertainty.</w:t>
+      </w:r>
+    </w:p>
+    <w:p>
+      <w:pPr>
+        <w:keepNext/>
+        <w:spacing w:before="80" w:after="40"/>
+      </w:pPr>
+      <w:r>
+        <w:rPr>
+          <w:i/>
+        </w:rPr>
+        <w:t xml:space="preserve">B. </w:t>
+      </w:r>
+      <w:r>
+        <w:rPr>
+          <w:i/>
+        </w:rPr>
+        <w:t>Limitations</w:t>
+      </w:r>
+    </w:p>
+    <w:p>
+      <w:pPr>
+        <w:spacing w:after="40"/>
+        <w:ind w:firstLine="245"/>
+        <w:jc w:val="both"/>
+      </w:pPr>
+      <w:r>
+        <w:rPr>
+          <w:sz w:val="20"/>
+        </w:rPr>
+        <w:t>The limitations are those of a reduced model: no existence, uniqueness, or continuous-dependence theorem is proved for the nonlinear heat problem, so “ill posed” and “well behaved” rest on numerical evidence over the tested conditions; one-dimensional energy transport with fixed density, equal temperatures, and local alpha deposition; one-way coupling to rotation; no pedestal, edge-localized-mode, or magnetohydrodynamic physics; generic critical-gradient parameters (benchmarked only at the level of Section VI); an uncalibrated threshold and length; and no experimental data. The plasma current, elongation, and the Troyon limit enter only the calibration. A predictive claim would require gyrokinetic calibration of s</w:t>
       </w:r>
       <w:r>
         <w:rPr>
@@ -11554,6 +11603,102 @@
           <w:sz w:val="20"/>
         </w:rPr>
         <w:t xml:space="preserve"> and ℓ, a self-consistent density and pedestal, and validation against experiment.</w:t>
+      </w:r>
+    </w:p>
+    <w:p>
+      <w:pPr>
+        <w:keepNext/>
+        <w:spacing w:before="80" w:after="40"/>
+      </w:pPr>
+      <w:r>
+        <w:rPr>
+          <w:i/>
+        </w:rPr>
+        <w:t xml:space="preserve">C. </w:t>
+      </w:r>
+      <w:r>
+        <w:rPr>
+          <w:i/>
+        </w:rPr>
+        <w:t>Implications for Compact, Cost-Constrained Tokamak Design</w:t>
+      </w:r>
+    </w:p>
+    <w:p>
+      <w:pPr>
+        <w:spacing w:after="40"/>
+        <w:ind w:firstLine="245"/>
+        <w:jc w:val="both"/>
+      </w:pPr>
+      <w:r>
+        <w:rPr>
+          <w:sz w:val="20"/>
+        </w:rPr>
+        <w:t>Compact devices have tight margins among confinement, field strength, auxiliary heating, and actuator capability, so a reduced transport model used to screen their operating regimes must not turn numerical artifacts into confinement gains. The present results bear on this only as a methodological prerequisite. The local closure is sensitive to the edge treatment and the resolution, whereas the regularized closure gave convergent solutions over the tested conditions; a predicted confinement improvement should therefore be accepted only after the flux admissibility, the grid convergence, and the sensitivity to the regularization length have been checked.</w:t>
+      </w:r>
+    </w:p>
+    <w:p>
+      <w:pPr>
+        <w:spacing w:after="40"/>
+        <w:ind w:firstLine="245"/>
+        <w:jc w:val="both"/>
+      </w:pPr>
+      <w:r>
+        <w:rPr>
+          <w:sz w:val="20"/>
+        </w:rPr>
+        <w:t>Auxiliary rotation drive is the clearest case. At the reactor-scale beam torque of Section VI-C the modelled gain is only 1.5% (s</w:t>
+      </w:r>
+      <w:r>
+        <w:rPr>
+          <w:sz w:val="20"/>
+          <w:vertAlign w:val="subscript"/>
+        </w:rPr>
+        <w:t>c</w:t>
+      </w:r>
+      <w:r>
+        <w:rPr>
+          <w:sz w:val="20"/>
+        </w:rPr>
+        <w:t xml:space="preserve"> = 0.5) to 9.3% (s</w:t>
+      </w:r>
+      <w:r>
+        <w:rPr>
+          <w:sz w:val="20"/>
+          <w:vertAlign w:val="subscript"/>
+        </w:rPr>
+        <w:t>c</w:t>
+      </w:r>
+      <w:r>
+        <w:rPr>
+          <w:sz w:val="20"/>
+        </w:rPr>
+        <w:t xml:space="preserve"> = 0.2), and larger gains need either stronger suppression or a torque far above that estimate. This says nothing about the torque a compact device requires, because size, field, beam energy, geometry, and momentum transport change the accessible regime.</w:t>
+      </w:r>
+    </w:p>
+    <w:p>
+      <w:pPr>
+        <w:spacing w:after="40"/>
+        <w:ind w:firstLine="245"/>
+        <w:jc w:val="both"/>
+      </w:pPr>
+      <w:r>
+        <w:rPr>
+          <w:sz w:val="20"/>
+        </w:rPr>
+        <w:t>A natural extension would apply the verified closure to a family of compact configurations that differ in major radius, minor radius, field, plasma current, and auxiliary power, and compare confinement time, fusion gain, actuator requirements, and operating margins under the same admissibility and convergence criteria; the one-dimensional model would first need geometric rescaling and equilibrium constraints. The relevant objective is not the largest modelled gain but an operating point that reaches adequate confinement with little auxiliary power and little sensitivity to the uncertain closure parameters. Weighing fusion output against auxiliary power, other power demands, and a normalized engineering cost would require a cost model, which is not part of this study.</w:t>
+      </w:r>
+    </w:p>
+    <w:p>
+      <w:pPr>
+        <w:spacing w:after="40"/>
+        <w:ind w:firstLine="245"/>
+        <w:jc w:val="both"/>
+      </w:pPr>
+      <w:r>
+        <w:rPr>
+          <w:sz w:val="20"/>
+        </w:rPr>
+        <w:t>The model is not sufficient to establish compact-device feasibility: it omits self-consistent equilibrium and stability, pedestal physics, current drive, magnet engineering, neutron shielding, and balance of plant, and the threshold and the length are uncalibrated against gyrokinetic calculations or experiment. The contribution is therefore a verified method for assessing closure sensitivity, not a prediction that a compact or low-cost tokamak can reach a given gain; neither plant-level net electric power nor cost is computed.</w:t>
       </w:r>
     </w:p>
     <w:p>
@@ -11579,7 +11724,7 @@
         <w:rPr>
           <w:sz w:val="20"/>
         </w:rPr>
-        <w:t>State-dependent shear-suppression closures need two things that are easy to overlook: an admissibility condition on the flux and a length that regularizes the shearing rate. With them the reduced model is verified, converges at second order, and gives a gain that follows ΔQ/Q = 0.056%/s</w:t>
+        <w:t>State-dependent shear-suppression closures need two things that are easy to overlook: an admissibility condition on the flux and a length that regularizes the shearing rate. With them the reduced model is verified, converges at second order, and gives a gain described over the tested range by the fitted relation ΔQ/Q = 0.056%/s</w:t>
       </w:r>
       <w:r>
         <w:rPr>
@@ -11592,7 +11737,7 @@
         <w:rPr>
           <w:sz w:val="20"/>
         </w:rPr>
-        <w:t>² with a documented uncertainty, while the local closure is ill posed and its answers depend on the edge treatment. The admissibility conditions are exact and tested to ten digits. The baseline is L-mode-like (H</w:t>
+        <w:t>² with a documented uncertainty, while the local closure is numerically ill posed and its answers depend on the edge treatment. The admissibility conditions are exact and tested to ten digits. The baseline is L-mode-like (H</w:t>
       </w:r>
       <w:r>
         <w:rPr>
@@ -11605,7 +11750,7 @@
         <w:rPr>
           <w:sz w:val="20"/>
         </w:rPr>
-        <w:t xml:space="preserve"> = 1.01), and neutral-beam torque of reactor size adds about 1.5%. The suppression threshold and the smoothing length are the quantities that a gyrokinetic calibration must supply before the gain can be used for design.</w:t>
+        <w:t xml:space="preserve"> = 1.01, a consistency check because the edge temperature is imposed), and neutral-beam torque of reactor size adds about 1.5%. The suppression threshold and the smoothing length are the quantities that a gyrokinetic calibration must supply before the gain can be used for design.</w:t>
       </w:r>
     </w:p>
     <w:p>
@@ -11657,7 +11802,7 @@
         <w:rPr>
           <w:sz w:val="20"/>
         </w:rPr>
-        <w:t>All code, tests, raw results (results.json), figure scripts, and the manuscript builders are at https://github.com/sandlerleon/tokamak-statedependent-closure (release v1.1.0) and archived at https://doi.org/10.5281/zenodo.23251965 (software, MIT licence); this manuscript is archived as a preprint at https://doi.org/10.5281/zenodo.23251966. No experimental data were used. A supplementary file contains the proofs, the numerical protocol, and extended tables.</w:t>
+        <w:t>All code, tests, raw results (results.json), figure scripts, and the manuscript builders are at https://github.com/sandlerleon/tokamak-statedependent-closure (release v1.1.1) and archived at https://doi.org/10.5281/zenodo.23267847 (software, MIT licence); this manuscript is archived as a preprint at https://doi.org/10.5281/zenodo.23267849. No experimental data were used. A supplementary file contains the proofs, the numerical protocol, and extended tables.</w:t>
       </w:r>
     </w:p>
     <w:p>

</xml_diff>

<commit_message>
v1.2.0: screening-level plant power balance (net electric power, relative cost proxy), Sec. VI-E, supplement S4, tests
Co-Authored-By: Claude Sonnet 5.5 <noreply@anthropic.com>
</commit_message>
<xml_diff>
--- a/manuscript/Admissibility_Shear_Closures_IEEE_TPS.docx
+++ b/manuscript/Admissibility_Shear_Closures_IEEE_TPS.docx
@@ -62,7 +62,7 @@
           <w:b/>
           <w:sz w:val="18"/>
         </w:rPr>
-        <w:t>Closures in which turbulent heat transport is suppressed by sheared plasma flow make the transport coefficient depend on the evolving profile, yet the conditions under which they define a solvable problem are rarely examined. This paper studies such closures in a reduced model of a reactor-scale tokamak, with a one-dimensional radial energy balance, fusion heating, and a toroidal-rotation equation, so that only the closure changes between runs. The local closure, whose shearing rate contains the second derivative of the temperature, is found numerically to be ill posed: its steady state depends on how the edge is treated, and a grid-scale instability appears at a threshold that grows as the square root of the number of cells. A closure that smooths the shearing rate over a fixed length is stable and grid converged over the tested conditions; its fusion gain converges at second order and is fitted by an inverse-square relation in the suppression threshold. For momentum transport, a steady flux relation gives closed-form conditions under which a shear-dependent viscosity admits a steady rotation profile and predicts its saturation, fold, and hysteresis, which direct solutions reproduce to ten digits. The baseline, with its edge temperature imposed, is consistent with an L-mode scaling (a check, not a validation), the smoothed closure raises the fusion gain by 0.6% at a threshold of 0.3 and by 6% at 0.1, and neutral-beam torque of reactor size adds about 1.5%. Parameter uncertainty is quantified. No experimental data are used.</w:t>
+        <w:t>Closures in which turbulent heat transport is suppressed by sheared plasma flow make the transport coefficient depend on the evolving profile, yet the conditions under which they define a solvable problem are rarely examined. This paper studies such closures in a reduced model of a reactor-scale tokamak, with a one-dimensional radial energy balance, fusion heating, and a toroidal-rotation equation, so that only the closure changes between runs. The local closure, whose shearing rate contains the second derivative of the temperature, is found numerically to be ill posed: its steady state depends on how the edge is treated, and a grid-scale instability appears at a threshold that grows as the square root of the number of cells. A closure that smooths the shearing rate over a fixed length is stable and grid converged over the tested conditions; its fusion gain converges at second order and is fitted by an inverse-square relation in the suppression threshold. For momentum transport, a steady flux relation gives closed-form conditions under which a shear-dependent viscosity admits a steady rotation profile and predicts its saturation, fold, and hysteresis, which direct solutions reproduce to ten digits. The baseline, with its edge temperature imposed, is consistent with an L-mode scaling (a check, not a validation), the smoothed closure raises the fusion gain by 0.6% at a threshold of 0.3 and by 6% at 0.1, and neutral-beam torque of reactor size adds about 1.5%. Parameter uncertainty and a screening-level plant power balance are quantified. No experimental data are used.</w:t>
       </w:r>
     </w:p>
     <w:p>
@@ -185,7 +185,7 @@
         <w:rPr>
           <w:sz w:val="20"/>
         </w:rPr>
-        <w:t>4)  A physical calibration: the baseline is benchmarked against recognized confinement scalings, operating limits, and neutral-beam torque, and the conclusions are stated as conditional on the unknown suppression threshold (Section VI).</w:t>
+        <w:t>4)  A physical calibration: the baseline is benchmarked against recognized confinement scalings, operating limits, and neutral-beam torque, a screening-level plant power balance gives the net electric power, and the conclusions are stated as conditional on the unknown suppression threshold (Section VI).</w:t>
       </w:r>
     </w:p>
     <w:p>
@@ -11459,6 +11459,59 @@
               <w:rPr>
                 <w:sz w:val="15"/>
               </w:rPr>
+              <w:t>Net electric power, baseline</w:t>
+            </w:r>
+          </w:p>
+        </w:tc>
+        <w:tc>
+          <w:tcPr>
+            <w:tcW w:type="dxa" w:w="1584"/>
+          </w:tcPr>
+          <w:p>
+            <w:pPr>
+              <w:spacing w:line="240" w:lineRule="auto" w:after="0"/>
+            </w:pPr>
+            <w:r/>
+            <w:r>
+              <w:rPr>
+                <w:sz w:val="15"/>
+              </w:rPr>
+              <w:t>-45 MW (assumed efficiencies)</w:t>
+            </w:r>
+          </w:p>
+        </w:tc>
+        <w:tc>
+          <w:tcPr>
+            <w:tcW w:type="dxa" w:w="1512"/>
+          </w:tcPr>
+          <w:p>
+            <w:pPr>
+              <w:spacing w:line="240" w:lineRule="auto" w:after="0"/>
+            </w:pPr>
+            <w:r/>
+            <w:r>
+              <w:rPr>
+                <w:sz w:val="15"/>
+              </w:rPr>
+              <w:t>this work</w:t>
+            </w:r>
+          </w:p>
+        </w:tc>
+      </w:tr>
+      <w:tr>
+        <w:tc>
+          <w:tcPr>
+            <w:tcW w:type="dxa" w:w="1944"/>
+          </w:tcPr>
+          <w:p>
+            <w:pPr>
+              <w:spacing w:line="240" w:lineRule="auto" w:after="0"/>
+            </w:pPr>
+            <w:r/>
+            <w:r>
+              <w:rPr>
+                <w:sz w:val="15"/>
+              </w:rPr>
               <w:t>ℓ / ρ</w:t>
             </w:r>
             <w:r>
@@ -11520,32 +11573,19 @@
     <w:p>
       <w:pPr>
         <w:keepNext/>
-        <w:spacing w:before="160" w:after="80"/>
-        <w:jc w:val="center"/>
-      </w:pPr>
-      <w:r>
-        <w:rPr>
-          <w:sz w:val="20"/>
-        </w:rPr>
-        <w:t>VII. DISCUSSION AND LIMITATIONS</w:t>
-      </w:r>
-    </w:p>
-    <w:p>
-      <w:pPr>
-        <w:keepNext/>
         <w:spacing w:before="80" w:after="40"/>
       </w:pPr>
       <w:r>
         <w:rPr>
           <w:i/>
         </w:rPr>
-        <w:t xml:space="preserve">A. </w:t>
+        <w:t xml:space="preserve">E. </w:t>
       </w:r>
       <w:r>
         <w:rPr>
           <w:i/>
         </w:rPr>
-        <w:t>Principal Findings</w:t>
+        <w:t>Plant Power Balance and Cost Proxy</w:t>
       </w:r>
     </w:p>
     <w:p>
@@ -11558,26 +11598,998 @@
         <w:rPr>
           <w:sz w:val="20"/>
         </w:rPr>
-        <w:t>Three findings stand out. First, whether a shear-suppression closure is well behaved is not a numerical detail: for the local closure the converged answer is set by an edge condition that the physics does not supply, and a consistent discretization is unstable at fine resolution. A local-closure result should therefore be reported with its edge treatment, resolution, and eigenvalues; the smoothed closure removes the issue at the price of one new length, to which the gain is insensitive (Table V). Second, the admissibility conditions are a priori checks that cost nothing and are reproduced to ten digits. Third, in this model the diamagnetic shear changes the gain by well under one per cent at moderate threshold, and the sensitivity to the threshold, not the form of the closure, dominates the uncertainty.</w:t>
+        <w:t>To say what the gain means for a power plant, the fusion and heating powers of the model are passed through a screening-level plant balance. It is an accounting of assumed efficiencies, not a design. The thermal power is P</w:t>
+      </w:r>
+      <w:r>
+        <w:rPr>
+          <w:sz w:val="20"/>
+          <w:vertAlign w:val="subscript"/>
+        </w:rPr>
+        <w:t>th</w:t>
+      </w:r>
+      <w:r>
+        <w:rPr>
+          <w:sz w:val="20"/>
+        </w:rPr>
+        <w:t xml:space="preserve"> = P</w:t>
+      </w:r>
+      <w:r>
+        <w:rPr>
+          <w:sz w:val="20"/>
+          <w:vertAlign w:val="subscript"/>
+        </w:rPr>
+        <w:t>fus</w:t>
+      </w:r>
+      <w:r>
+        <w:rPr>
+          <w:sz w:val="20"/>
+        </w:rPr>
+        <w:t>(f</w:t>
+      </w:r>
+      <w:r>
+        <w:rPr>
+          <w:sz w:val="20"/>
+          <w:vertAlign w:val="subscript"/>
+        </w:rPr>
+        <w:t>n</w:t>
+      </w:r>
+      <w:r>
+        <w:rPr>
+          <w:sz w:val="20"/>
+        </w:rPr>
+        <w:t>M + 1 − f</w:t>
+      </w:r>
+      <w:r>
+        <w:rPr>
+          <w:sz w:val="20"/>
+          <w:vertAlign w:val="subscript"/>
+        </w:rPr>
+        <w:t>n</w:t>
+      </w:r>
+      <w:r>
+        <w:rPr>
+          <w:sz w:val="20"/>
+        </w:rPr>
+        <w:t>) + P</w:t>
+      </w:r>
+      <w:r>
+        <w:rPr>
+          <w:sz w:val="20"/>
+          <w:vertAlign w:val="subscript"/>
+        </w:rPr>
+        <w:t>aux</w:t>
+      </w:r>
+      <w:r>
+        <w:rPr>
+          <w:sz w:val="20"/>
+        </w:rPr>
+        <w:t>, with neutron energy fraction f</w:t>
+      </w:r>
+      <w:r>
+        <w:rPr>
+          <w:sz w:val="20"/>
+          <w:vertAlign w:val="subscript"/>
+        </w:rPr>
+        <w:t>n</w:t>
+      </w:r>
+      <w:r>
+        <w:rPr>
+          <w:sz w:val="20"/>
+        </w:rPr>
+        <w:t xml:space="preserve"> = 0.80, blanket energy multiplication M, and all injected heating power ending as heat; the gross electric power is η</w:t>
+      </w:r>
+      <w:r>
+        <w:rPr>
+          <w:sz w:val="20"/>
+          <w:vertAlign w:val="subscript"/>
+        </w:rPr>
+        <w:t>th</w:t>
+      </w:r>
+      <w:r>
+        <w:rPr>
+          <w:sz w:val="20"/>
+        </w:rPr>
+        <w:t>P</w:t>
+      </w:r>
+      <w:r>
+        <w:rPr>
+          <w:sz w:val="20"/>
+          <w:vertAlign w:val="subscript"/>
+        </w:rPr>
+        <w:t>th</w:t>
+      </w:r>
+      <w:r>
+        <w:rPr>
+          <w:sz w:val="20"/>
+        </w:rPr>
+        <w:t>; and the recirculating power is P</w:t>
+      </w:r>
+      <w:r>
+        <w:rPr>
+          <w:sz w:val="20"/>
+          <w:vertAlign w:val="subscript"/>
+        </w:rPr>
+        <w:t>aux</w:t>
+      </w:r>
+      <w:r>
+        <w:rPr>
+          <w:sz w:val="20"/>
+        </w:rPr>
+        <w:t>/η</w:t>
+      </w:r>
+      <w:r>
+        <w:rPr>
+          <w:sz w:val="20"/>
+          <w:vertAlign w:val="subscript"/>
+        </w:rPr>
+        <w:t>aux</w:t>
+      </w:r>
+      <w:r>
+        <w:rPr>
+          <w:sz w:val="20"/>
+        </w:rPr>
+        <w:t xml:space="preserve"> + P</w:t>
+      </w:r>
+      <w:r>
+        <w:rPr>
+          <w:sz w:val="20"/>
+          <w:vertAlign w:val="subscript"/>
+        </w:rPr>
+        <w:t>other</w:t>
+      </w:r>
+      <w:r>
+        <w:rPr>
+          <w:sz w:val="20"/>
+        </w:rPr>
+        <w:t>, where P</w:t>
+      </w:r>
+      <w:r>
+        <w:rPr>
+          <w:sz w:val="20"/>
+          <w:vertAlign w:val="subscript"/>
+        </w:rPr>
+        <w:t>other</w:t>
+      </w:r>
+      <w:r>
+        <w:rPr>
+          <w:sz w:val="20"/>
+        </w:rPr>
+        <w:t xml:space="preserve"> stands for cryogenics, pumps, the tritium plant, and control. Then P</w:t>
+      </w:r>
+      <w:r>
+        <w:rPr>
+          <w:sz w:val="20"/>
+          <w:vertAlign w:val="subscript"/>
+        </w:rPr>
+        <w:t>net</w:t>
+      </w:r>
+      <w:r>
+        <w:rPr>
+          <w:sz w:val="20"/>
+        </w:rPr>
+        <w:t xml:space="preserve"> = η</w:t>
+      </w:r>
+      <w:r>
+        <w:rPr>
+          <w:sz w:val="20"/>
+          <w:vertAlign w:val="subscript"/>
+        </w:rPr>
+        <w:t>th</w:t>
+      </w:r>
+      <w:r>
+        <w:rPr>
+          <w:sz w:val="20"/>
+        </w:rPr>
+        <w:t>P</w:t>
+      </w:r>
+      <w:r>
+        <w:rPr>
+          <w:sz w:val="20"/>
+          <w:vertAlign w:val="subscript"/>
+        </w:rPr>
+        <w:t>th</w:t>
+      </w:r>
+      <w:r>
+        <w:rPr>
+          <w:sz w:val="20"/>
+        </w:rPr>
+        <w:t xml:space="preserve"> − P</w:t>
+      </w:r>
+      <w:r>
+        <w:rPr>
+          <w:sz w:val="20"/>
+          <w:vertAlign w:val="subscript"/>
+        </w:rPr>
+        <w:t>aux</w:t>
+      </w:r>
+      <w:r>
+        <w:rPr>
+          <w:sz w:val="20"/>
+        </w:rPr>
+        <w:t>/η</w:t>
+      </w:r>
+      <w:r>
+        <w:rPr>
+          <w:sz w:val="20"/>
+          <w:vertAlign w:val="subscript"/>
+        </w:rPr>
+        <w:t>aux</w:t>
+      </w:r>
+      <w:r>
+        <w:rPr>
+          <w:sz w:val="20"/>
+        </w:rPr>
+        <w:t xml:space="preserve"> − P</w:t>
+      </w:r>
+      <w:r>
+        <w:rPr>
+          <w:sz w:val="20"/>
+          <w:vertAlign w:val="subscript"/>
+        </w:rPr>
+        <w:t>other</w:t>
+      </w:r>
+      <w:r>
+        <w:rPr>
+          <w:sz w:val="20"/>
+        </w:rPr>
+        <w:t>. The central values η</w:t>
+      </w:r>
+      <w:r>
+        <w:rPr>
+          <w:sz w:val="20"/>
+          <w:vertAlign w:val="subscript"/>
+        </w:rPr>
+        <w:t>th</w:t>
+      </w:r>
+      <w:r>
+        <w:rPr>
+          <w:sz w:val="20"/>
+        </w:rPr>
+        <w:t xml:space="preserve"> = 0.40, M = 1.2, η</w:t>
+      </w:r>
+      <w:r>
+        <w:rPr>
+          <w:sz w:val="20"/>
+          <w:vertAlign w:val="subscript"/>
+        </w:rPr>
+        <w:t>aux</w:t>
+      </w:r>
+      <w:r>
+        <w:rPr>
+          <w:sz w:val="20"/>
+        </w:rPr>
+        <w:t xml:space="preserve"> = 0.40, and P</w:t>
+      </w:r>
+      <w:r>
+        <w:rPr>
+          <w:sz w:val="20"/>
+          <w:vertAlign w:val="subscript"/>
+        </w:rPr>
+        <w:t>other</w:t>
+      </w:r>
+      <w:r>
+        <w:rPr>
+          <w:sz w:val="20"/>
+        </w:rPr>
+        <w:t xml:space="preserve"> = 30 MW are varied over 0.33–0.45, 1.1–1.3, 0.30–0.50, and 10–60 MW with a scrambled Sobol sequence (256 points, fixed seed).</w:t>
       </w:r>
     </w:p>
     <w:p>
       <w:pPr>
         <w:keepNext/>
-        <w:spacing w:before="80" w:after="40"/>
+        <w:spacing w:before="120"/>
+        <w:jc w:val="center"/>
       </w:pPr>
       <w:r>
         <w:rPr>
-          <w:i/>
-        </w:rPr>
-        <w:t xml:space="preserve">B. </w:t>
-      </w:r>
-      <w:r>
-        <w:rPr>
-          <w:i/>
-        </w:rPr>
-        <w:t>Limitations</w:t>
-      </w:r>
+          <w:sz w:val="16"/>
+        </w:rPr>
+        <w:t>TABLE IX</w:t>
+      </w:r>
+    </w:p>
+    <w:p>
+      <w:pPr>
+        <w:keepNext/>
+        <w:spacing w:after="60"/>
+        <w:jc w:val="center"/>
+      </w:pPr>
+      <w:r>
+        <w:rPr>
+          <w:smallCaps/>
+          <w:sz w:val="16"/>
+        </w:rPr>
+        <w:t>Screening-level plant power balance (MW) at the central assumptions; the recirculating power is 130 MW in every case</w:t>
+      </w:r>
+    </w:p>
+    <w:tbl>
+      <w:tblPr>
+        <w:tblStyle w:val="TableGrid"/>
+        <w:tblW w:type="auto" w:w="0"/>
+        <w:jc w:val="center"/>
+        <w:tblLayout w:type="fixed"/>
+        <w:tblLook w:firstColumn="1" w:firstRow="1" w:lastColumn="0" w:lastRow="0" w:noHBand="0" w:noVBand="1" w:val="04A0"/>
+      </w:tblPr>
+      <w:tblGrid>
+        <w:gridCol w:w="2088"/>
+        <w:gridCol w:w="720"/>
+        <w:gridCol w:w="792"/>
+        <w:gridCol w:w="720"/>
+        <w:gridCol w:w="720"/>
+      </w:tblGrid>
+      <w:tr>
+        <w:trPr>
+          <w:tblHeader w:val="true"/>
+        </w:trPr>
+        <w:tc>
+          <w:tcPr>
+            <w:tcW w:type="dxa" w:w="2088"/>
+            <w:shd w:val="clear" w:color="auto" w:fill="E7ECF1"/>
+          </w:tcPr>
+          <w:p>
+            <w:pPr>
+              <w:spacing w:line="240" w:lineRule="auto" w:after="0"/>
+            </w:pPr>
+            <w:r/>
+            <w:r>
+              <w:rPr>
+                <w:b/>
+                <w:sz w:val="15"/>
+              </w:rPr>
+              <w:t>Case (P</w:t>
+            </w:r>
+            <w:r>
+              <w:rPr>
+                <w:b/>
+                <w:sz w:val="15"/>
+                <w:vertAlign w:val="subscript"/>
+              </w:rPr>
+              <w:t>aux</w:t>
+            </w:r>
+            <w:r>
+              <w:rPr>
+                <w:b/>
+                <w:sz w:val="15"/>
+              </w:rPr>
+              <w:t xml:space="preserve"> = 40 MW)</w:t>
+            </w:r>
+          </w:p>
+        </w:tc>
+        <w:tc>
+          <w:tcPr>
+            <w:tcW w:type="dxa" w:w="720"/>
+            <w:shd w:val="clear" w:color="auto" w:fill="E7ECF1"/>
+          </w:tcPr>
+          <w:p>
+            <w:pPr>
+              <w:spacing w:line="240" w:lineRule="auto" w:after="0"/>
+            </w:pPr>
+            <w:r/>
+            <w:r>
+              <w:rPr>
+                <w:b/>
+                <w:sz w:val="15"/>
+              </w:rPr>
+              <w:t>P</w:t>
+            </w:r>
+            <w:r>
+              <w:rPr>
+                <w:b/>
+                <w:sz w:val="15"/>
+                <w:vertAlign w:val="subscript"/>
+              </w:rPr>
+              <w:t>fus</w:t>
+            </w:r>
+          </w:p>
+        </w:tc>
+        <w:tc>
+          <w:tcPr>
+            <w:tcW w:type="dxa" w:w="792"/>
+            <w:shd w:val="clear" w:color="auto" w:fill="E7ECF1"/>
+          </w:tcPr>
+          <w:p>
+            <w:pPr>
+              <w:spacing w:line="240" w:lineRule="auto" w:after="0"/>
+            </w:pPr>
+            <w:r/>
+            <w:r>
+              <w:rPr>
+                <w:b/>
+                <w:sz w:val="15"/>
+              </w:rPr>
+              <w:t>P</w:t>
+            </w:r>
+            <w:r>
+              <w:rPr>
+                <w:b/>
+                <w:sz w:val="15"/>
+                <w:vertAlign w:val="subscript"/>
+              </w:rPr>
+              <w:t>gross</w:t>
+            </w:r>
+          </w:p>
+        </w:tc>
+        <w:tc>
+          <w:tcPr>
+            <w:tcW w:type="dxa" w:w="720"/>
+            <w:shd w:val="clear" w:color="auto" w:fill="E7ECF1"/>
+          </w:tcPr>
+          <w:p>
+            <w:pPr>
+              <w:spacing w:line="240" w:lineRule="auto" w:after="0"/>
+            </w:pPr>
+            <w:r/>
+            <w:r>
+              <w:rPr>
+                <w:b/>
+                <w:sz w:val="15"/>
+              </w:rPr>
+              <w:t>P</w:t>
+            </w:r>
+            <w:r>
+              <w:rPr>
+                <w:b/>
+                <w:sz w:val="15"/>
+                <w:vertAlign w:val="subscript"/>
+              </w:rPr>
+              <w:t>net</w:t>
+            </w:r>
+          </w:p>
+        </w:tc>
+        <w:tc>
+          <w:tcPr>
+            <w:tcW w:type="dxa" w:w="720"/>
+            <w:shd w:val="clear" w:color="auto" w:fill="E7ECF1"/>
+          </w:tcPr>
+          <w:p>
+            <w:pPr>
+              <w:spacing w:line="240" w:lineRule="auto" w:after="0"/>
+            </w:pPr>
+            <w:r/>
+            <w:r>
+              <w:rPr>
+                <w:b/>
+                <w:sz w:val="15"/>
+              </w:rPr>
+              <w:t>ΔP</w:t>
+            </w:r>
+            <w:r>
+              <w:rPr>
+                <w:b/>
+                <w:sz w:val="15"/>
+                <w:vertAlign w:val="subscript"/>
+              </w:rPr>
+              <w:t>net</w:t>
+            </w:r>
+          </w:p>
+        </w:tc>
+      </w:tr>
+      <w:tr>
+        <w:tc>
+          <w:tcPr>
+            <w:tcW w:type="dxa" w:w="2088"/>
+          </w:tcPr>
+          <w:p>
+            <w:pPr>
+              <w:spacing w:line="240" w:lineRule="auto" w:after="0"/>
+            </w:pPr>
+            <w:r/>
+            <w:r>
+              <w:rPr>
+                <w:sz w:val="15"/>
+              </w:rPr>
+              <w:t>baseline</w:t>
+            </w:r>
+          </w:p>
+        </w:tc>
+        <w:tc>
+          <w:tcPr>
+            <w:tcW w:type="dxa" w:w="720"/>
+          </w:tcPr>
+          <w:p>
+            <w:pPr>
+              <w:spacing w:line="240" w:lineRule="auto" w:after="0"/>
+            </w:pPr>
+            <w:r/>
+            <w:r>
+              <w:rPr>
+                <w:sz w:val="15"/>
+              </w:rPr>
+              <w:t>148</w:t>
+            </w:r>
+          </w:p>
+        </w:tc>
+        <w:tc>
+          <w:tcPr>
+            <w:tcW w:type="dxa" w:w="792"/>
+          </w:tcPr>
+          <w:p>
+            <w:pPr>
+              <w:spacing w:line="240" w:lineRule="auto" w:after="0"/>
+            </w:pPr>
+            <w:r/>
+            <w:r>
+              <w:rPr>
+                <w:sz w:val="15"/>
+              </w:rPr>
+              <w:t>85</w:t>
+            </w:r>
+          </w:p>
+        </w:tc>
+        <w:tc>
+          <w:tcPr>
+            <w:tcW w:type="dxa" w:w="720"/>
+          </w:tcPr>
+          <w:p>
+            <w:pPr>
+              <w:spacing w:line="240" w:lineRule="auto" w:after="0"/>
+            </w:pPr>
+            <w:r/>
+            <w:r>
+              <w:rPr>
+                <w:sz w:val="15"/>
+              </w:rPr>
+              <w:t>-45</w:t>
+            </w:r>
+          </w:p>
+        </w:tc>
+        <w:tc>
+          <w:tcPr>
+            <w:tcW w:type="dxa" w:w="720"/>
+          </w:tcPr>
+          <w:p>
+            <w:pPr>
+              <w:spacing w:line="240" w:lineRule="auto" w:after="0"/>
+            </w:pPr>
+            <w:r/>
+            <w:r>
+              <w:rPr>
+                <w:sz w:val="15"/>
+              </w:rPr>
+              <w:t>0</w:t>
+            </w:r>
+          </w:p>
+        </w:tc>
+      </w:tr>
+      <w:tr>
+        <w:tc>
+          <w:tcPr>
+            <w:tcW w:type="dxa" w:w="2088"/>
+          </w:tcPr>
+          <w:p>
+            <w:pPr>
+              <w:spacing w:line="240" w:lineRule="auto" w:after="0"/>
+            </w:pPr>
+            <w:r/>
+            <w:r>
+              <w:rPr>
+                <w:sz w:val="15"/>
+              </w:rPr>
+              <w:t>smoothed, s_c = 0.3</w:t>
+            </w:r>
+          </w:p>
+        </w:tc>
+        <w:tc>
+          <w:tcPr>
+            <w:tcW w:type="dxa" w:w="720"/>
+          </w:tcPr>
+          <w:p>
+            <w:pPr>
+              <w:spacing w:line="240" w:lineRule="auto" w:after="0"/>
+            </w:pPr>
+            <w:r/>
+            <w:r>
+              <w:rPr>
+                <w:sz w:val="15"/>
+              </w:rPr>
+              <w:t>149</w:t>
+            </w:r>
+          </w:p>
+        </w:tc>
+        <w:tc>
+          <w:tcPr>
+            <w:tcW w:type="dxa" w:w="792"/>
+          </w:tcPr>
+          <w:p>
+            <w:pPr>
+              <w:spacing w:line="240" w:lineRule="auto" w:after="0"/>
+            </w:pPr>
+            <w:r/>
+            <w:r>
+              <w:rPr>
+                <w:sz w:val="15"/>
+              </w:rPr>
+              <w:t>85</w:t>
+            </w:r>
+          </w:p>
+        </w:tc>
+        <w:tc>
+          <w:tcPr>
+            <w:tcW w:type="dxa" w:w="720"/>
+          </w:tcPr>
+          <w:p>
+            <w:pPr>
+              <w:spacing w:line="240" w:lineRule="auto" w:after="0"/>
+            </w:pPr>
+            <w:r/>
+            <w:r>
+              <w:rPr>
+                <w:sz w:val="15"/>
+              </w:rPr>
+              <w:t>-45</w:t>
+            </w:r>
+          </w:p>
+        </w:tc>
+        <w:tc>
+          <w:tcPr>
+            <w:tcW w:type="dxa" w:w="720"/>
+          </w:tcPr>
+          <w:p>
+            <w:pPr>
+              <w:spacing w:line="240" w:lineRule="auto" w:after="0"/>
+            </w:pPr>
+            <w:r/>
+            <w:r>
+              <w:rPr>
+                <w:sz w:val="15"/>
+              </w:rPr>
+              <w:t>+0.4</w:t>
+            </w:r>
+          </w:p>
+        </w:tc>
+      </w:tr>
+      <w:tr>
+        <w:tc>
+          <w:tcPr>
+            <w:tcW w:type="dxa" w:w="2088"/>
+          </w:tcPr>
+          <w:p>
+            <w:pPr>
+              <w:spacing w:line="240" w:lineRule="auto" w:after="0"/>
+            </w:pPr>
+            <w:r/>
+            <w:r>
+              <w:rPr>
+                <w:sz w:val="15"/>
+              </w:rPr>
+              <w:t>smoothed, s_c = 0.1</w:t>
+            </w:r>
+          </w:p>
+        </w:tc>
+        <w:tc>
+          <w:tcPr>
+            <w:tcW w:type="dxa" w:w="720"/>
+          </w:tcPr>
+          <w:p>
+            <w:pPr>
+              <w:spacing w:line="240" w:lineRule="auto" w:after="0"/>
+            </w:pPr>
+            <w:r/>
+            <w:r>
+              <w:rPr>
+                <w:sz w:val="15"/>
+              </w:rPr>
+              <w:t>157</w:t>
+            </w:r>
+          </w:p>
+        </w:tc>
+        <w:tc>
+          <w:tcPr>
+            <w:tcW w:type="dxa" w:w="792"/>
+          </w:tcPr>
+          <w:p>
+            <w:pPr>
+              <w:spacing w:line="240" w:lineRule="auto" w:after="0"/>
+            </w:pPr>
+            <w:r/>
+            <w:r>
+              <w:rPr>
+                <w:sz w:val="15"/>
+              </w:rPr>
+              <w:t>89</w:t>
+            </w:r>
+          </w:p>
+        </w:tc>
+        <w:tc>
+          <w:tcPr>
+            <w:tcW w:type="dxa" w:w="720"/>
+          </w:tcPr>
+          <w:p>
+            <w:pPr>
+              <w:spacing w:line="240" w:lineRule="auto" w:after="0"/>
+            </w:pPr>
+            <w:r/>
+            <w:r>
+              <w:rPr>
+                <w:sz w:val="15"/>
+              </w:rPr>
+              <w:t>-41</w:t>
+            </w:r>
+          </w:p>
+        </w:tc>
+        <w:tc>
+          <w:tcPr>
+            <w:tcW w:type="dxa" w:w="720"/>
+          </w:tcPr>
+          <w:p>
+            <w:pPr>
+              <w:spacing w:line="240" w:lineRule="auto" w:after="0"/>
+            </w:pPr>
+            <w:r/>
+            <w:r>
+              <w:rPr>
+                <w:sz w:val="15"/>
+              </w:rPr>
+              <w:t>+4.0</w:t>
+            </w:r>
+          </w:p>
+        </w:tc>
+      </w:tr>
+      <w:tr>
+        <w:tc>
+          <w:tcPr>
+            <w:tcW w:type="dxa" w:w="2088"/>
+          </w:tcPr>
+          <w:p>
+            <w:pPr>
+              <w:spacing w:line="240" w:lineRule="auto" w:after="0"/>
+            </w:pPr>
+            <w:r/>
+            <w:r>
+              <w:rPr>
+                <w:sz w:val="15"/>
+              </w:rPr>
+              <w:t>smoothed, s_c = 0.05</w:t>
+            </w:r>
+          </w:p>
+        </w:tc>
+        <w:tc>
+          <w:tcPr>
+            <w:tcW w:type="dxa" w:w="720"/>
+          </w:tcPr>
+          <w:p>
+            <w:pPr>
+              <w:spacing w:line="240" w:lineRule="auto" w:after="0"/>
+            </w:pPr>
+            <w:r/>
+            <w:r>
+              <w:rPr>
+                <w:sz w:val="15"/>
+              </w:rPr>
+              <w:t>183</w:t>
+            </w:r>
+          </w:p>
+        </w:tc>
+        <w:tc>
+          <w:tcPr>
+            <w:tcW w:type="dxa" w:w="792"/>
+          </w:tcPr>
+          <w:p>
+            <w:pPr>
+              <w:spacing w:line="240" w:lineRule="auto" w:after="0"/>
+            </w:pPr>
+            <w:r/>
+            <w:r>
+              <w:rPr>
+                <w:sz w:val="15"/>
+              </w:rPr>
+              <w:t>101</w:t>
+            </w:r>
+          </w:p>
+        </w:tc>
+        <w:tc>
+          <w:tcPr>
+            <w:tcW w:type="dxa" w:w="720"/>
+          </w:tcPr>
+          <w:p>
+            <w:pPr>
+              <w:spacing w:line="240" w:lineRule="auto" w:after="0"/>
+            </w:pPr>
+            <w:r/>
+            <w:r>
+              <w:rPr>
+                <w:sz w:val="15"/>
+              </w:rPr>
+              <w:t>-29</w:t>
+            </w:r>
+          </w:p>
+        </w:tc>
+        <w:tc>
+          <w:tcPr>
+            <w:tcW w:type="dxa" w:w="720"/>
+          </w:tcPr>
+          <w:p>
+            <w:pPr>
+              <w:spacing w:line="240" w:lineRule="auto" w:after="0"/>
+            </w:pPr>
+            <w:r/>
+            <w:r>
+              <w:rPr>
+                <w:sz w:val="15"/>
+              </w:rPr>
+              <w:t>+16.2</w:t>
+            </w:r>
+          </w:p>
+        </w:tc>
+      </w:tr>
+      <w:tr>
+        <w:tc>
+          <w:tcPr>
+            <w:tcW w:type="dxa" w:w="2088"/>
+          </w:tcPr>
+          <w:p>
+            <w:pPr>
+              <w:spacing w:line="240" w:lineRule="auto" w:after="0"/>
+            </w:pPr>
+            <w:r/>
+            <w:r>
+              <w:rPr>
+                <w:sz w:val="15"/>
+              </w:rPr>
+              <w:t>s_c = 0.5, 36 N m</w:t>
+            </w:r>
+          </w:p>
+        </w:tc>
+        <w:tc>
+          <w:tcPr>
+            <w:tcW w:type="dxa" w:w="720"/>
+          </w:tcPr>
+          <w:p>
+            <w:pPr>
+              <w:spacing w:line="240" w:lineRule="auto" w:after="0"/>
+            </w:pPr>
+            <w:r/>
+            <w:r>
+              <w:rPr>
+                <w:sz w:val="15"/>
+              </w:rPr>
+              <w:t>151</w:t>
+            </w:r>
+          </w:p>
+        </w:tc>
+        <w:tc>
+          <w:tcPr>
+            <w:tcW w:type="dxa" w:w="792"/>
+          </w:tcPr>
+          <w:p>
+            <w:pPr>
+              <w:spacing w:line="240" w:lineRule="auto" w:after="0"/>
+            </w:pPr>
+            <w:r/>
+            <w:r>
+              <w:rPr>
+                <w:sz w:val="15"/>
+              </w:rPr>
+              <w:t>86</w:t>
+            </w:r>
+          </w:p>
+        </w:tc>
+        <w:tc>
+          <w:tcPr>
+            <w:tcW w:type="dxa" w:w="720"/>
+          </w:tcPr>
+          <w:p>
+            <w:pPr>
+              <w:spacing w:line="240" w:lineRule="auto" w:after="0"/>
+            </w:pPr>
+            <w:r/>
+            <w:r>
+              <w:rPr>
+                <w:sz w:val="15"/>
+              </w:rPr>
+              <w:t>-44</w:t>
+            </w:r>
+          </w:p>
+        </w:tc>
+        <w:tc>
+          <w:tcPr>
+            <w:tcW w:type="dxa" w:w="720"/>
+          </w:tcPr>
+          <w:p>
+            <w:pPr>
+              <w:spacing w:line="240" w:lineRule="auto" w:after="0"/>
+            </w:pPr>
+            <w:r/>
+            <w:r>
+              <w:rPr>
+                <w:sz w:val="15"/>
+              </w:rPr>
+              <w:t>+1.2</w:t>
+            </w:r>
+          </w:p>
+        </w:tc>
+      </w:tr>
+      <w:tr>
+        <w:tc>
+          <w:tcPr>
+            <w:tcW w:type="dxa" w:w="2088"/>
+          </w:tcPr>
+          <w:p>
+            <w:pPr>
+              <w:spacing w:line="240" w:lineRule="auto" w:after="0"/>
+            </w:pPr>
+            <w:r/>
+            <w:r>
+              <w:rPr>
+                <w:sz w:val="15"/>
+              </w:rPr>
+              <w:t>s_c = 0.5, 200 N m</w:t>
+            </w:r>
+          </w:p>
+        </w:tc>
+        <w:tc>
+          <w:tcPr>
+            <w:tcW w:type="dxa" w:w="720"/>
+          </w:tcPr>
+          <w:p>
+            <w:pPr>
+              <w:spacing w:line="240" w:lineRule="auto" w:after="0"/>
+            </w:pPr>
+            <w:r/>
+            <w:r>
+              <w:rPr>
+                <w:sz w:val="15"/>
+              </w:rPr>
+              <w:t>198</w:t>
+            </w:r>
+          </w:p>
+        </w:tc>
+        <w:tc>
+          <w:tcPr>
+            <w:tcW w:type="dxa" w:w="792"/>
+          </w:tcPr>
+          <w:p>
+            <w:pPr>
+              <w:spacing w:line="240" w:lineRule="auto" w:after="0"/>
+            </w:pPr>
+            <w:r/>
+            <w:r>
+              <w:rPr>
+                <w:sz w:val="15"/>
+              </w:rPr>
+              <w:t>108</w:t>
+            </w:r>
+          </w:p>
+        </w:tc>
+        <w:tc>
+          <w:tcPr>
+            <w:tcW w:type="dxa" w:w="720"/>
+          </w:tcPr>
+          <w:p>
+            <w:pPr>
+              <w:spacing w:line="240" w:lineRule="auto" w:after="0"/>
+            </w:pPr>
+            <w:r/>
+            <w:r>
+              <w:rPr>
+                <w:sz w:val="15"/>
+              </w:rPr>
+              <w:t>-22</w:t>
+            </w:r>
+          </w:p>
+        </w:tc>
+        <w:tc>
+          <w:tcPr>
+            <w:tcW w:type="dxa" w:w="720"/>
+          </w:tcPr>
+          <w:p>
+            <w:pPr>
+              <w:spacing w:line="240" w:lineRule="auto" w:after="0"/>
+            </w:pPr>
+            <w:r/>
+            <w:r>
+              <w:rPr>
+                <w:sz w:val="15"/>
+              </w:rPr>
+              <w:t>+23.1</w:t>
+            </w:r>
+          </w:p>
+        </w:tc>
+      </w:tr>
+    </w:tbl>
+    <w:p>
+      <w:pPr>
+        <w:spacing w:after="80"/>
+      </w:pPr>
     </w:p>
     <w:p>
       <w:pPr>
@@ -11589,38 +12601,98 @@
         <w:rPr>
           <w:sz w:val="20"/>
         </w:rPr>
-        <w:t>The limitations are those of a reduced model: no existence, uniqueness, or continuous-dependence theorem is proved for the nonlinear heat problem, so “ill posed” and “well behaved” rest on numerical evidence over the tested conditions; one-dimensional energy transport with fixed density, equal temperatures, and local alpha deposition; one-way coupling to rotation; no pedestal, edge-localized-mode, or magnetohydrodynamic physics; generic critical-gradient parameters (benchmarked only at the level of Section VI); an uncalibrated threshold and length; and no experimental data. The plasma current, elongation, and the Troyon limit enter only the calibration. A predictive claim would require gyrokinetic calibration of s</w:t>
+        <w:t>At P</w:t>
       </w:r>
       <w:r>
         <w:rPr>
           <w:sz w:val="20"/>
           <w:vertAlign w:val="subscript"/>
         </w:rPr>
+        <w:t>aux</w:t>
+      </w:r>
+      <w:r>
+        <w:rPr>
+          <w:sz w:val="20"/>
+        </w:rPr>
+        <w:t xml:space="preserve"> = 40 MW the baseline gives P</w:t>
+      </w:r>
+      <w:r>
+        <w:rPr>
+          <w:sz w:val="20"/>
+          <w:vertAlign w:val="subscript"/>
+        </w:rPr>
+        <w:t>fus</w:t>
+      </w:r>
+      <w:r>
+        <w:rPr>
+          <w:sz w:val="20"/>
+        </w:rPr>
+        <w:t xml:space="preserve"> = 148 MW and P</w:t>
+      </w:r>
+      <w:r>
+        <w:rPr>
+          <w:sz w:val="20"/>
+          <w:vertAlign w:val="subscript"/>
+        </w:rPr>
+        <w:t>net</w:t>
+      </w:r>
+      <w:r>
+        <w:rPr>
+          <w:sz w:val="20"/>
+        </w:rPr>
+        <w:t xml:space="preserve"> = -45 MW (Table IX): engineering breakeven would need a physical gain of Q = 6.14 instead of 3.70. The net power is negative for all 256 sampled assumptions (5–95 %: -92 to -17 MW), and when P</w:t>
+      </w:r>
+      <w:r>
+        <w:rPr>
+          <w:sz w:val="20"/>
+          <w:vertAlign w:val="subscript"/>
+        </w:rPr>
+        <w:t>aux</w:t>
+      </w:r>
+      <w:r>
+        <w:rPr>
+          <w:sz w:val="20"/>
+        </w:rPr>
+        <w:t xml:space="preserve"> is reduced it rises monotonically to -8 MW at the lowest value scanned (10 MW), so the plasma of this model is below engineering breakeven under every assumption tried except the most favorable corner at low heating power (best over the power scan: positive for 18 % of draws). The closure raises P</w:t>
+      </w:r>
+      <w:r>
+        <w:rPr>
+          <w:sz w:val="20"/>
+          <w:vertAlign w:val="subscript"/>
+        </w:rPr>
+        <w:t>net</w:t>
+      </w:r>
+      <w:r>
+        <w:rPr>
+          <w:sz w:val="20"/>
+        </w:rPr>
+        <w:t xml:space="preserve"> by 0.4 MW at s</w:t>
+      </w:r>
+      <w:r>
+        <w:rPr>
+          <w:sz w:val="20"/>
+          <w:vertAlign w:val="subscript"/>
+        </w:rPr>
         <w:t>c</w:t>
       </w:r>
       <w:r>
         <w:rPr>
           <w:sz w:val="20"/>
         </w:rPr>
-        <w:t xml:space="preserve"> and ℓ, a self-consistent density and pedestal, and validation against experiment.</w:t>
-      </w:r>
-    </w:p>
-    <w:p>
-      <w:pPr>
-        <w:keepNext/>
-        <w:spacing w:before="80" w:after="40"/>
-      </w:pPr>
-      <w:r>
-        <w:rPr>
-          <w:i/>
-        </w:rPr>
-        <w:t xml:space="preserve">C. </w:t>
-      </w:r>
-      <w:r>
-        <w:rPr>
-          <w:i/>
-        </w:rPr>
-        <w:t>Implications for Compact, Cost-Constrained Tokamak Design</w:t>
+        <w:t xml:space="preserve"> = 0.3, 4.0 MW at 0.1 (3.3–4.5 MW over the assumptions), and 16.2 MW at 0.05, and by 1.2 MW at the neutral-beam torque estimate, a small share of the 45 MW deficit; only 1 % (s</w:t>
+      </w:r>
+      <w:r>
+        <w:rPr>
+          <w:sz w:val="20"/>
+          <w:vertAlign w:val="subscript"/>
+        </w:rPr>
+        <w:t>c</w:t>
+      </w:r>
+      <w:r>
+        <w:rPr>
+          <w:sz w:val="20"/>
+        </w:rPr>
+        <w:t xml:space="preserve"> = 0.1) and 5 % (0.05) of the draws reach positive net power. The net electric power is therefore a statement about the assumptions as much as the closure, but the increment the closure adds is robust to them.</w:t>
       </w:r>
     </w:p>
     <w:p>
@@ -11633,7 +12705,116 @@
         <w:rPr>
           <w:sz w:val="20"/>
         </w:rPr>
-        <w:t>Compact devices have tight margins among confinement, field strength, auxiliary heating, and actuator capability, so a reduced transport model used to screen their operating regimes must not turn numerical artifacts into confinement gains. The present results bear on this only as a methodological prerequisite. The local closure is sensitive to the edge treatment and the resolution, whereas the regularized closure gave convergent solutions over the tested conditions; a predicted confinement improvement should therefore be accepted only after the flux admissibility, the grid convergence, and the sensitivity to the regularization length have been checked.</w:t>
+        <w:t>Cost is not computed. A relative proxy is defined for use when designs differ in heating power, C</w:t>
+      </w:r>
+      <w:r>
+        <w:rPr>
+          <w:sz w:val="20"/>
+          <w:vertAlign w:val="subscript"/>
+        </w:rPr>
+        <w:t>rel</w:t>
+      </w:r>
+      <w:r>
+        <w:rPr>
+          <w:sz w:val="20"/>
+        </w:rPr>
+        <w:t xml:space="preserve"> = 1 + κ(P</w:t>
+      </w:r>
+      <w:r>
+        <w:rPr>
+          <w:sz w:val="20"/>
+          <w:vertAlign w:val="subscript"/>
+        </w:rPr>
+        <w:t>aux</w:t>
+      </w:r>
+      <w:r>
+        <w:rPr>
+          <w:sz w:val="20"/>
+        </w:rPr>
+        <w:t>/40 MW − 1), with κ = 0.10 (range 0.05–0.20) the assumed share of the reference capital that scales with heating power. Because every case here has the same geometry and heating power, C</w:t>
+      </w:r>
+      <w:r>
+        <w:rPr>
+          <w:sz w:val="20"/>
+          <w:vertAlign w:val="subscript"/>
+        </w:rPr>
+        <w:t>rel</w:t>
+      </w:r>
+      <w:r>
+        <w:rPr>
+          <w:sz w:val="20"/>
+        </w:rPr>
+        <w:t xml:space="preserve"> = 1 for all of them and the proxy cannot separate the closures; and because P</w:t>
+      </w:r>
+      <w:r>
+        <w:rPr>
+          <w:sz w:val="20"/>
+          <w:vertAlign w:val="subscript"/>
+        </w:rPr>
+        <w:t>net</w:t>
+      </w:r>
+      <w:r>
+        <w:rPr>
+          <w:sz w:val="20"/>
+        </w:rPr>
+        <w:t xml:space="preserve"> is negative, the ratio P</w:t>
+      </w:r>
+      <w:r>
+        <w:rPr>
+          <w:sz w:val="20"/>
+          <w:vertAlign w:val="subscript"/>
+        </w:rPr>
+        <w:t>net</w:t>
+      </w:r>
+      <w:r>
+        <w:rPr>
+          <w:sz w:val="20"/>
+        </w:rPr>
+        <w:t>/C</w:t>
+      </w:r>
+      <w:r>
+        <w:rPr>
+          <w:sz w:val="20"/>
+          <w:vertAlign w:val="subscript"/>
+        </w:rPr>
+        <w:t>rel</w:t>
+      </w:r>
+      <w:r>
+        <w:rPr>
+          <w:sz w:val="20"/>
+        </w:rPr>
+        <w:t xml:space="preserve"> has no meaning. A cost comparison across devices of different size or field would need a cost model, which is not part of this study.</w:t>
+      </w:r>
+    </w:p>
+    <w:p>
+      <w:pPr>
+        <w:keepNext/>
+        <w:spacing w:before="160" w:after="80"/>
+        <w:jc w:val="center"/>
+      </w:pPr>
+      <w:r>
+        <w:rPr>
+          <w:sz w:val="20"/>
+        </w:rPr>
+        <w:t>VII. DISCUSSION AND LIMITATIONS</w:t>
+      </w:r>
+    </w:p>
+    <w:p>
+      <w:pPr>
+        <w:keepNext/>
+        <w:spacing w:before="80" w:after="40"/>
+      </w:pPr>
+      <w:r>
+        <w:rPr>
+          <w:i/>
+        </w:rPr>
+        <w:t xml:space="preserve">A. </w:t>
+      </w:r>
+      <w:r>
+        <w:rPr>
+          <w:i/>
+        </w:rPr>
+        <w:t>Principal Findings</w:t>
       </w:r>
     </w:p>
     <w:p>
@@ -11646,33 +12827,25 @@
         <w:rPr>
           <w:sz w:val="20"/>
         </w:rPr>
-        <w:t>Auxiliary rotation drive is the clearest case. At the reactor-scale beam torque of Section VI-C the modelled gain is only 1.5% (s</w:t>
-      </w:r>
-      <w:r>
-        <w:rPr>
-          <w:sz w:val="20"/>
-          <w:vertAlign w:val="subscript"/>
-        </w:rPr>
-        <w:t>c</w:t>
-      </w:r>
-      <w:r>
-        <w:rPr>
-          <w:sz w:val="20"/>
-        </w:rPr>
-        <w:t xml:space="preserve"> = 0.5) to 9.3% (s</w:t>
-      </w:r>
-      <w:r>
-        <w:rPr>
-          <w:sz w:val="20"/>
-          <w:vertAlign w:val="subscript"/>
-        </w:rPr>
-        <w:t>c</w:t>
-      </w:r>
-      <w:r>
-        <w:rPr>
-          <w:sz w:val="20"/>
-        </w:rPr>
-        <w:t xml:space="preserve"> = 0.2), and larger gains need either stronger suppression or a torque far above that estimate. This says nothing about the torque a compact device requires, because size, field, beam energy, geometry, and momentum transport change the accessible regime.</w:t>
+        <w:t>Three findings stand out. First, whether a shear-suppression closure is well behaved is not a numerical detail: for the local closure the converged answer is set by an edge condition that the physics does not supply, and a consistent discretization is unstable at fine resolution. A local-closure result should therefore be reported with its edge treatment, resolution, and eigenvalues; the smoothed closure removes the issue at the price of one new length, to which the gain is insensitive (Table V). Second, the admissibility conditions are a priori checks that cost nothing and are reproduced to ten digits. Third, in this model the diamagnetic shear changes the gain by well under one per cent at moderate threshold, and the sensitivity to the threshold, not the form of the closure, dominates the uncertainty.</w:t>
+      </w:r>
+    </w:p>
+    <w:p>
+      <w:pPr>
+        <w:keepNext/>
+        <w:spacing w:before="80" w:after="40"/>
+      </w:pPr>
+      <w:r>
+        <w:rPr>
+          <w:i/>
+        </w:rPr>
+        <w:t xml:space="preserve">B. </w:t>
+      </w:r>
+      <w:r>
+        <w:rPr>
+          <w:i/>
+        </w:rPr>
+        <w:t>Limitations</w:t>
       </w:r>
     </w:p>
     <w:p>
@@ -11685,7 +12858,38 @@
         <w:rPr>
           <w:sz w:val="20"/>
         </w:rPr>
-        <w:t>A natural extension would apply the verified closure to a family of compact configurations that differ in major radius, minor radius, field, plasma current, and auxiliary power, and compare confinement time, fusion gain, actuator requirements, and operating margins under the same admissibility and convergence criteria; the one-dimensional model would first need geometric rescaling and equilibrium constraints. The relevant objective is not the largest modelled gain but an operating point that reaches adequate confinement with little auxiliary power and little sensitivity to the uncertain closure parameters. Weighing fusion output against auxiliary power, other power demands, and a normalized engineering cost would require a cost model, which is not part of this study.</w:t>
+        <w:t>The limitations are those of a reduced model: no existence, uniqueness, or continuous-dependence theorem is proved for the nonlinear heat problem, so “ill posed” and “well behaved” rest on numerical evidence over the tested conditions; one-dimensional energy transport with fixed density, equal temperatures, and local alpha deposition; one-way coupling to rotation; no pedestal, edge-localized-mode, or magnetohydrodynamic physics; generic critical-gradient parameters (benchmarked only at the level of Section VI); an uncalibrated threshold and length; and no experimental data. The plasma current, elongation, and the Troyon limit enter only the calibration. A predictive claim would require gyrokinetic calibration of s</w:t>
+      </w:r>
+      <w:r>
+        <w:rPr>
+          <w:sz w:val="20"/>
+          <w:vertAlign w:val="subscript"/>
+        </w:rPr>
+        <w:t>c</w:t>
+      </w:r>
+      <w:r>
+        <w:rPr>
+          <w:sz w:val="20"/>
+        </w:rPr>
+        <w:t xml:space="preserve"> and ℓ, a self-consistent density and pedestal, and validation against experiment.</w:t>
+      </w:r>
+    </w:p>
+    <w:p>
+      <w:pPr>
+        <w:keepNext/>
+        <w:spacing w:before="80" w:after="40"/>
+      </w:pPr>
+      <w:r>
+        <w:rPr>
+          <w:i/>
+        </w:rPr>
+        <w:t xml:space="preserve">C. </w:t>
+      </w:r>
+      <w:r>
+        <w:rPr>
+          <w:i/>
+        </w:rPr>
+        <w:t>Implications for Compact, Cost-Constrained Tokamak Design</w:t>
       </w:r>
     </w:p>
     <w:p>
@@ -11698,7 +12902,72 @@
         <w:rPr>
           <w:sz w:val="20"/>
         </w:rPr>
-        <w:t>The model is not sufficient to establish compact-device feasibility: it omits self-consistent equilibrium and stability, pedestal physics, current drive, magnet engineering, neutron shielding, and balance of plant, and the threshold and the length are uncalibrated against gyrokinetic calculations or experiment. The contribution is therefore a verified method for assessing closure sensitivity, not a prediction that a compact or low-cost tokamak can reach a given gain; neither plant-level net electric power nor cost is computed.</w:t>
+        <w:t>Compact devices have tight margins among confinement, field strength, auxiliary heating, and actuator capability, so a reduced transport model used to screen their operating regimes must not turn numerical artifacts into confinement gains. The present results bear on this only as a methodological prerequisite. The local closure is sensitive to the edge treatment and the resolution, whereas the regularized closure gave convergent solutions over the tested conditions; a predicted confinement improvement should therefore be accepted only after the flux admissibility, the grid convergence, and the sensitivity to the regularization length have been checked.</w:t>
+      </w:r>
+    </w:p>
+    <w:p>
+      <w:pPr>
+        <w:spacing w:after="40"/>
+        <w:ind w:firstLine="245"/>
+        <w:jc w:val="both"/>
+      </w:pPr>
+      <w:r>
+        <w:rPr>
+          <w:sz w:val="20"/>
+        </w:rPr>
+        <w:t>Auxiliary rotation drive is the clearest case. At the reactor-scale beam torque of Section VI-C the modelled gain is only 1.5% (s</w:t>
+      </w:r>
+      <w:r>
+        <w:rPr>
+          <w:sz w:val="20"/>
+          <w:vertAlign w:val="subscript"/>
+        </w:rPr>
+        <w:t>c</w:t>
+      </w:r>
+      <w:r>
+        <w:rPr>
+          <w:sz w:val="20"/>
+        </w:rPr>
+        <w:t xml:space="preserve"> = 0.5) to 9.3% (s</w:t>
+      </w:r>
+      <w:r>
+        <w:rPr>
+          <w:sz w:val="20"/>
+          <w:vertAlign w:val="subscript"/>
+        </w:rPr>
+        <w:t>c</w:t>
+      </w:r>
+      <w:r>
+        <w:rPr>
+          <w:sz w:val="20"/>
+        </w:rPr>
+        <w:t xml:space="preserve"> = 0.2), and larger gains need either stronger suppression or a torque far above that estimate. This says nothing about the torque a compact device requires, because size, field, beam energy, geometry, and momentum transport change the accessible regime.</w:t>
+      </w:r>
+    </w:p>
+    <w:p>
+      <w:pPr>
+        <w:spacing w:after="40"/>
+        <w:ind w:firstLine="245"/>
+        <w:jc w:val="both"/>
+      </w:pPr>
+      <w:r>
+        <w:rPr>
+          <w:sz w:val="20"/>
+        </w:rPr>
+        <w:t>A natural extension would apply the verified closure to a family of compact configurations that differ in major radius, minor radius, field, plasma current, and auxiliary power, and compare confinement time, fusion gain, actuator requirements, and operating margins under the same admissibility and convergence criteria; the one-dimensional model would first need geometric rescaling and equilibrium constraints. The relevant objective is not the largest modelled gain but an operating point that reaches adequate confinement with little auxiliary power and little sensitivity to the uncertain closure parameters. The screening-level plant balance of Section VI-E gives the electric side of that weighing for the reference device; a normalized engineering cost would require a cost model, which is not part of this study.</w:t>
+      </w:r>
+    </w:p>
+    <w:p>
+      <w:pPr>
+        <w:spacing w:after="40"/>
+        <w:ind w:firstLine="245"/>
+        <w:jc w:val="both"/>
+      </w:pPr>
+      <w:r>
+        <w:rPr>
+          <w:sz w:val="20"/>
+        </w:rPr>
+        <w:t>The model is not sufficient to establish compact-device feasibility: it omits self-consistent equilibrium and stability, pedestal physics, current drive, magnet engineering, neutron shielding, and balance of plant, and the threshold and the length are uncalibrated against gyrokinetic calculations or experiment. The contribution is therefore a verified method for assessing closure sensitivity, not a prediction that a compact or low-cost tokamak can reach a given gain: the net electric power of Section VI-E is an accounting under assumed efficiencies for the reference device only, and no cost is computed.</w:t>
       </w:r>
     </w:p>
     <w:p>
@@ -11750,7 +13019,7 @@
         <w:rPr>
           <w:sz w:val="20"/>
         </w:rPr>
-        <w:t xml:space="preserve"> = 1.01, a consistency check because the edge temperature is imposed), and neutral-beam torque of reactor size adds about 1.5%. The suppression threshold and the smoothing length are the quantities that a gyrokinetic calibration must supply before the gain can be used for design.</w:t>
+        <w:t xml:space="preserve"> = 1.01, a consistency check because the edge temperature is imposed), neutral-beam torque of reactor size adds about 1.5%, and under assumed plant efficiencies the modelled plasma is below engineering breakeven, which the closure moves by only a few megawatts at moderate thresholds. The suppression threshold and the smoothing length are the quantities that a gyrokinetic calibration must supply before the gain can be used for design.</w:t>
       </w:r>
     </w:p>
     <w:p>
@@ -11802,7 +13071,7 @@
         <w:rPr>
           <w:sz w:val="20"/>
         </w:rPr>
-        <w:t>All code, tests, raw results (results.json), figure scripts, and the manuscript builders are at https://github.com/sandlerleon/tokamak-statedependent-closure (release v1.1.1) and archived at https://doi.org/10.5281/zenodo.23267847 (software, MIT licence); this manuscript is archived as a preprint at https://doi.org/10.5281/zenodo.23267849. No experimental data were used. A supplementary file contains the proofs, the numerical protocol, and extended tables.</w:t>
+        <w:t>All code, tests, raw results (results.json), figure scripts, and the manuscript builders are at https://github.com/sandlerleon/tokamak-statedependent-closure (release v1.2.0) and archived at https://doi.org/10.5281/zenodo.23268573 (software, MIT licence); this manuscript is archived as a preprint at https://doi.org/10.5281/zenodo.23268576. No experimental data were used. A supplementary file contains the proofs, the numerical protocol, and extended tables.</w:t>
       </w:r>
     </w:p>
     <w:p>

</xml_diff>

<commit_message>
Merge safe copyedits (US spelling, punctuation), cover letter: power balance limited to 40 MW operating point, qualify 40 MW wording
Co-Authored-By: Claude Sonnet 5.5 <noreply@anthropic.com>
</commit_message>
<xml_diff>
--- a/manuscript/Admissibility_Shear_Closures_IEEE_TPS.docx
+++ b/manuscript/Admissibility_Shear_Closures_IEEE_TPS.docx
@@ -36,7 +36,7 @@
           <w:i/>
           <w:sz w:val="18"/>
         </w:rPr>
-        <w:t>Independent researcher, Northbrook, IL 60062 USA (e-mail: sandler.leon@gmail.com; ORCID: 0009-0007-4584-808X)</w:t>
+        <w:t>Independent researcher, Northbrook, IL 60062, USA (e-mail: sandler.leon@gmail.com; ORCID: 0009-0007-4584-808X)</w:t>
       </w:r>
     </w:p>
     <w:p>
@@ -62,7 +62,7 @@
           <w:b/>
           <w:sz w:val="18"/>
         </w:rPr>
-        <w:t>Closures in which turbulent heat transport is suppressed by sheared plasma flow make the transport coefficient depend on the evolving profile, yet the conditions under which they define a solvable problem are rarely examined. This paper studies such closures in a reduced model of a reactor-scale tokamak, with a one-dimensional radial energy balance, fusion heating, and a toroidal-rotation equation, so that only the closure changes between runs. The local closure, whose shearing rate contains the second derivative of the temperature, is found numerically to be ill posed: its steady state depends on how the edge is treated, and a grid-scale instability appears at a threshold that grows as the square root of the number of cells. A closure that smooths the shearing rate over a fixed length is stable and grid converged over the tested conditions; its fusion gain converges at second order and is fitted by an inverse-square relation in the suppression threshold. For momentum transport, a steady flux relation gives closed-form conditions under which a shear-dependent viscosity admits a steady rotation profile and predicts its saturation, fold, and hysteresis, which direct solutions reproduce to ten digits. The baseline, with its edge temperature imposed, is consistent with an L-mode scaling (a check, not a validation), the smoothed closure raises the fusion gain by 0.6% at a threshold of 0.3 and by 6% at 0.1, and neutral-beam torque of reactor size adds about 1.5%. Parameter uncertainty and a screening-level plant power balance are quantified. No experimental data are used.</w:t>
+        <w:t>Closures in which turbulent heat transport is suppressed by sheared plasma flow make the transport coefficient depend on the evolving profile; however, the conditions under which they define a solvable problem are rarely examined. This paper studies such closures in a reduced model of a reactor-scale tokamak, with a one-dimensional radial energy balance, fusion heating, and a toroidal-rotation equation, so that only the closure changes between runs. The local closure, whose shearing rate contains the second derivative of the temperature, is found numerically to be ill posed: its steady state depends on how the edge is treated, and a grid-scale instability appears at a threshold that grows as the square root of the number of cells. A closure that smooths the shearing rate over a fixed length is stable and grid converged over the tested conditions; its fusion gain converges at second order and is fitted by an inverse-square relation in the suppression threshold. For momentum transport, a steady flux relation gives closed-form conditions under which a shear-dependent viscosity admits a steady rotation profile and predicts its saturation, fold, and hysteresis, for which direct solutions reproduce to ten digits. The baseline, with its edge temperature imposed, is consistent with an L-mode scaling (a check, not a validation), the smoothed closure raises the fusion gain by 0.6% at a threshold of 0.3 and by 6% at 0.1, and neutral-beam torque of reactor size adds about 1.5%. Parameter uncertainty and a screening-level plant power balance are quantified. No experimental data are used.</w:t>
       </w:r>
     </w:p>
     <w:p>
@@ -120,7 +120,7 @@
         <w:rPr>
           <w:sz w:val="20"/>
         </w:rPr>
-        <w:t>Predicting energy confinement in a tokamak requires a model of the transport driven by micro-turbulence. The transport is stiff: above a critical normalized temperature gradient a small increase of the gradient produces a large increase of the heat flux, so profiles are pinned near marginal stability [1], [2]. Sheared E×B flow decorrelates the turbulence and reduces the transport; this underlies the edge transport barrier and many improved-confinement regimes [3]–[6], and quench rules that suppress the turbulence when the shearing rate exceeds a growth-rate scale are used in transport models [7]. A closure that encodes this is state dependent: the shearing rate is a function of the evolving profile, and the feedback it creates is the standard route to bistability and hysteresis in models of the L–H transition [8], [9].</w:t>
+        <w:t>Predicting energy confinement in a tokamak requires a model of the transport driven by microturbulence. The transport is stiff: above a critical normalized temperature gradient, a small increase in the gradient produces a large increase in the heat flux, so profiles are pinned near marginal stability [1], [2]. Sheared E×B flow decorrelates the turbulence and reduces the transport; this underlies the edge transport barrier and many improved-confinement regimes [3]–[6], and quench rules that suppress the turbulence when the shearing rate exceeds a growth-rate scale are used in transport models [7]. A closure that encodes this is state dependent: the shearing rate is a function of the evolving profile, and the feedback it creates is the standard route to bistability and hysteresis in models of the L–H transition [8], [9].</w:t>
       </w:r>
     </w:p>
     <w:p>
@@ -4683,7 +4683,7 @@
         <w:rPr>
           <w:sz w:val="20"/>
         </w:rPr>
-        <w:t>) = 0.3086, for any α. Proofs are in the supplement. This is the condition under which a nonlinear diffusion problem with a drive-dependent flux is well posed [13], and part (c) is the rotation analogue of the S-curve of L–H models [8], [9].</w:t>
+        <w:t>) = 0.3086, for any α. Proofs are in the supplement. This is the condition under which a nonlinear diffusion problem with a drive-dependent flux is well posed [13], and part (c) is the rotation analog of the S-curve of L–H models [8], [9].</w:t>
       </w:r>
     </w:p>
     <w:p>
@@ -6663,7 +6663,7 @@
         <w:rPr>
           <w:sz w:val="20"/>
         </w:rPr>
-        <w:t xml:space="preserve"> = 0.047; this disappears when the edge is treated consistently, so it is an artifact. Imposing an explicit extra edge condition (the last cell takes its neighbour's shearing rate, or no suppression in the last cell) makes the local closure stable and convergent, but the two answers differ by 10% at s</w:t>
+        <w:t xml:space="preserve"> = 0.047; this disappears when the edge is treated consistently, so it is an artifact. Imposing an explicit extra edge condition (the last cell takes its neighbor's shearing rate, or no suppression in the last cell) makes the local closure stable and convergent, but the two answers differ by 10% at s</w:t>
       </w:r>
       <w:r>
         <w:rPr>
@@ -9210,7 +9210,7 @@
         <w:rPr>
           <w:sz w:val="16"/>
         </w:rPr>
-        <w:t xml:space="preserve"> with the fitted inverse-square relation (dashed) and the 5–95 % interval from the parameter-uncertainty study (bars). (b) Convergence of Q with N (dotted: N</w:t>
+        <w:t xml:space="preserve"> with the fitted inverse-square relation (dashed) and the 5–95% interval from the parameter-uncertainty study (bars). (b) Convergence of Q with N (dotted: N</w:t>
       </w:r>
       <w:r>
         <w:rPr>
@@ -10438,7 +10438,7 @@
         <w:rPr>
           <w:sz w:val="20"/>
         </w:rPr>
-        <w:t>, B ∈ [4.8, 5.8] T, and ℓ ∈ [0.02, 0.10] m (128 converged). The baseline gain Q varies from 1.6 to 7.1 (5–95 %), but the relative gain is far more stable: 0.5–0.8% at s</w:t>
+        <w:t>, B ∈ [4.8, 5.8] T, and ℓ ∈ [0.02, 0.10] m (128 converged). The baseline gain Q varies from 1.6 to 7.1 (5–95%), but the relative gain is far more stable: 0.5–0.8% at s</w:t>
       </w:r>
       <w:r>
         <w:rPr>
@@ -12640,7 +12640,7 @@
         <w:rPr>
           <w:sz w:val="20"/>
         </w:rPr>
-        <w:t xml:space="preserve"> = -45 MW (Table IX): engineering breakeven would need a physical gain of Q = 6.14 instead of 3.70. The net power is negative for all 256 sampled assumptions (5–95 %: -92 to -17 MW), and when P</w:t>
+        <w:t xml:space="preserve"> = -45 MW (Table IX): engineering breakeven would need a physical gain of Q = 6.14 instead of 3.70. The net power is negative for all 256 sampled assumptions (5–95%: -92 to -17 MW), and when P</w:t>
       </w:r>
       <w:r>
         <w:rPr>
@@ -12653,7 +12653,7 @@
         <w:rPr>
           <w:sz w:val="20"/>
         </w:rPr>
-        <w:t xml:space="preserve"> is reduced it rises monotonically to -8 MW at the lowest value scanned (10 MW), so the plasma of this model is below engineering breakeven under every assumption tried except the most favorable corner at low heating power (best over the power scan: positive for 18 % of draws). The closure raises P</w:t>
+        <w:t xml:space="preserve"> is reduced it rises monotonically to -8 MW at the lowest value scanned (10 MW), so the plasma of this model is below engineering breakeven under every assumption tried except the most favorable corner at low heating power (best over the power scan: positive for 18% of draws). The closure raises P</w:t>
       </w:r>
       <w:r>
         <w:rPr>
@@ -12679,7 +12679,7 @@
         <w:rPr>
           <w:sz w:val="20"/>
         </w:rPr>
-        <w:t xml:space="preserve"> = 0.3, 4.0 MW at 0.1 (3.3–4.5 MW over the assumptions), and 16.2 MW at 0.05, and by 1.2 MW at the neutral-beam torque estimate, a small share of the 45 MW deficit; only 1 % (s</w:t>
+        <w:t xml:space="preserve"> = 0.3, 4.0 MW at 0.1 (3.3–4.5 MW over the assumptions), and 16.2 MW at 0.05, and by 1.2 MW at the neutral-beam torque estimate, a small share of the 45 MW deficit; only 1% (s</w:t>
       </w:r>
       <w:r>
         <w:rPr>
@@ -12692,7 +12692,7 @@
         <w:rPr>
           <w:sz w:val="20"/>
         </w:rPr>
-        <w:t xml:space="preserve"> = 0.1) and 5 % (0.05) of the draws reach positive net power. The net electric power is therefore a statement about the assumptions as much as the closure, but the increment the closure adds is robust to them.</w:t>
+        <w:t xml:space="preserve"> = 0.1) and 5% (0.05) of the draws reach positive net power. The net electric power is therefore a statement about the assumptions as much as the closure, but the increment the closure adds is robust to them.</w:t>
       </w:r>
     </w:p>
     <w:p>
@@ -12827,7 +12827,7 @@
         <w:rPr>
           <w:sz w:val="20"/>
         </w:rPr>
-        <w:t>Three findings stand out. First, whether a shear-suppression closure is well behaved is not a numerical detail: for the local closure the converged answer is set by an edge condition that the physics does not supply, and a consistent discretization is unstable at fine resolution. A local-closure result should therefore be reported with its edge treatment, resolution, and eigenvalues; the smoothed closure removes the issue at the price of one new length, to which the gain is insensitive (Table V). Second, the admissibility conditions are a priori checks that cost nothing and are reproduced to ten digits. Third, in this model the diamagnetic shear changes the gain by well under one per cent at moderate threshold, and the sensitivity to the threshold, not the form of the closure, dominates the uncertainty.</w:t>
+        <w:t>Three findings stand out. First, whether a shear-suppression closure is well behaved is not a numerical detail: for the local closure the converged answer is set by an edge condition that the physics does not supply, and a consistent discretization is unstable at fine resolution. A local-closure result should therefore be reported with its edge treatment, resolution, and eigenvalues; the smoothed closure removes the issue at the price of one new length, to which the gain is insensitive (Table V). Second, the admissibility conditions are a priori checks that cost nothing and are reproduced to ten digits. Third, in this model the diamagnetic shear changes the gain by well under one percent at moderate threshold, and the sensitivity to the threshold, not the form of the closure, dominates the uncertainty.</w:t>
       </w:r>
     </w:p>
     <w:p>
@@ -12915,7 +12915,7 @@
         <w:rPr>
           <w:sz w:val="20"/>
         </w:rPr>
-        <w:t>Auxiliary rotation drive is the clearest case. At the reactor-scale beam torque of Section VI-C the modelled gain is only 1.5% (s</w:t>
+        <w:t>Auxiliary rotation drive is the clearest case. At the reactor-scale beam torque of Section VI-C the modeled gain is only 1.5% (s</w:t>
       </w:r>
       <w:r>
         <w:rPr>
@@ -12954,7 +12954,7 @@
         <w:rPr>
           <w:sz w:val="20"/>
         </w:rPr>
-        <w:t>A natural extension would apply the verified closure to a family of compact configurations that differ in major radius, minor radius, field, plasma current, and auxiliary power, and compare confinement time, fusion gain, actuator requirements, and operating margins under the same admissibility and convergence criteria; the one-dimensional model would first need geometric rescaling and equilibrium constraints. The relevant objective is not the largest modelled gain but an operating point that reaches adequate confinement with little auxiliary power and little sensitivity to the uncertain closure parameters. The screening-level plant balance of Section VI-E gives the electric side of that weighing for the reference device; a normalized engineering cost would require a cost model, which is not part of this study.</w:t>
+        <w:t>A natural extension would apply the verified closure to a family of compact configurations that differ in major radius, minor radius, field, plasma current, and auxiliary power, and compare confinement time, fusion gain, actuator requirements, and operating margins under the same admissibility and convergence criteria; the one-dimensional model would first need geometric rescaling and equilibrium constraints. The relevant objective is not the largest modeled gain but an operating point that reaches adequate confinement with little auxiliary power and little sensitivity to the uncertain closure parameters. The screening-level plant balance of Section VI-E gives the electric side of that weighing for the reference device; a normalized engineering cost would require a cost model, which is not part of this study.</w:t>
       </w:r>
     </w:p>
     <w:p>
@@ -13019,7 +13019,7 @@
         <w:rPr>
           <w:sz w:val="20"/>
         </w:rPr>
-        <w:t xml:space="preserve"> = 1.01, a consistency check because the edge temperature is imposed), neutral-beam torque of reactor size adds about 1.5%, and under assumed plant efficiencies the modelled plasma is below engineering breakeven, which the closure moves by only a few megawatts at moderate thresholds. The suppression threshold and the smoothing length are the quantities that a gyrokinetic calibration must supply before the gain can be used for design.</w:t>
+        <w:t xml:space="preserve"> = 1.01, a consistency check because the edge temperature is imposed), neutral-beam torque of reactor size adds about 1.5%, and under assumed plant efficiencies the modeled plasma at 40 MW heating is below engineering breakeven, which the closure moves by only a few megawatts at moderate thresholds. The suppression threshold and the smoothing length are the quantities that a gyrokinetic calibration must supply before the gain can be used for design.</w:t>
       </w:r>
     </w:p>
     <w:p>
@@ -13071,7 +13071,7 @@
         <w:rPr>
           <w:sz w:val="20"/>
         </w:rPr>
-        <w:t>All code, tests, raw results (results.json), figure scripts, and the manuscript builders are at https://github.com/sandlerleon/tokamak-statedependent-closure (release v1.2.0) and archived at https://doi.org/10.5281/zenodo.23268573 (software, MIT licence); this manuscript is archived as a preprint at https://doi.org/10.5281/zenodo.23268576. No experimental data were used. A supplementary file contains the proofs, the numerical protocol, and extended tables.</w:t>
+        <w:t>All code, tests, raw results (results.json), figure scripts, and the manuscript builders are at https://github.com/sandlerleon/tokamak-statedependent-closure (release v1.2.0) and archived at https://doi.org/10.5281/zenodo.23268573 (software, MIT license); this manuscript is archived as a preprint at https://doi.org/10.5281/zenodo.23268576. No experimental data were used. A supplementary file contains the proofs, the numerical protocol, and extended tables.</w:t>
       </w:r>
     </w:p>
     <w:p>

</xml_diff>

<commit_message>
v1.2.1: wording revision after review (numerical-instability wording, exact Prop. 2-3 boundary cases, clearer plant-balance paragraph, all tables cited, shorter abstract)
Computed results and code unchanged (55/55 checks pass).

Co-Authored-By: Claude Sonnet 5.5 <noreply@anthropic.com>
</commit_message>
<xml_diff>
--- a/manuscript/Admissibility_Shear_Closures_IEEE_TPS.docx
+++ b/manuscript/Admissibility_Shear_Closures_IEEE_TPS.docx
@@ -62,7 +62,7 @@
           <w:b/>
           <w:sz w:val="18"/>
         </w:rPr>
-        <w:t>Closures in which turbulent heat transport is suppressed by sheared plasma flow make the transport coefficient depend on the evolving profile; however, the conditions under which they define a solvable problem are rarely examined. This paper studies such closures in a reduced model of a reactor-scale tokamak, with a one-dimensional radial energy balance, fusion heating, and a toroidal-rotation equation, so that only the closure changes between runs. The local closure, whose shearing rate contains the second derivative of the temperature, is found numerically to be ill posed: its steady state depends on how the edge is treated, and a grid-scale instability appears at a threshold that grows as the square root of the number of cells. A closure that smooths the shearing rate over a fixed length is stable and grid converged over the tested conditions; its fusion gain converges at second order and is fitted by an inverse-square relation in the suppression threshold. For momentum transport, a steady flux relation gives closed-form conditions under which a shear-dependent viscosity admits a steady rotation profile and predicts its saturation, fold, and hysteresis, for which direct solutions reproduce to ten digits. The baseline, with its edge temperature imposed, is consistent with an L-mode scaling (a check, not a validation), the smoothed closure raises the fusion gain by 0.6% at a threshold of 0.3 and by 6% at 0.1, and neutral-beam torque of reactor size adds about 1.5%. Parameter uncertainty and a screening-level plant power balance are quantified. No experimental data are used.</w:t>
+        <w:t>Closures in which turbulent heat transport is suppressed by sheared plasma flow make the transport coefficient depend on the evolving profile; however, the conditions under which they define a solvable problem are rarely examined. This paper studies such closures in a reduced model of a reactor-scale tokamak, with a one-dimensional radial energy balance, fusion heating, and a toroidal-rotation equation, so that only the closure changes between runs. The local closure, whose shearing rate contains the second derivative of the temperature, exhibits numerical instability and sensitivity to the edge treatment under the tested conditions: a grid-scale instability appears at a threshold that grows as the square root of the number of cells. A closure that smooths the shearing rate over a fixed length is stable and grid converged over the tested conditions; its fusion gain converges at second order and is fitted by an inverse-square relation in the suppression threshold. For momentum transport, a steady flux relation gives closed-form conditions under which a shear-dependent viscosity admits a steady rotation profile and predicts its saturation, fold, and hysteresis, for which direct solutions reproduce to ten digits. The baseline, with its edge temperature imposed, is consistent with an L-mode scaling (a check, not a validation), the smoothed closure raises the fusion gain by 0.6% at a threshold of 0.3 and by 6% at 0.1, and neutral-beam torque of reactor size adds about 1.5%. Parameter uncertainty and a screening-level plant power balance are quantified. No experimental data are used.</w:t>
       </w:r>
     </w:p>
     <w:p>
@@ -159,7 +159,7 @@
         <w:rPr>
           <w:sz w:val="20"/>
         </w:rPr>
-        <w:t>2)  A diagnosis of the local heat closure: because the shearing rate contains the second derivative of the temperature, the steady problem is numerically ill posed, and a smoothed (adaptive-field) closure with a fixed length restores numerical stability and convergence over the tested conditions (Sections III-B and V-A).</w:t>
+        <w:t>2)  A diagnosis of the local heat closure: because the shearing rate contains the second derivative of the temperature, the steady problem shows numerical instability and a dependence on the edge treatment under the tested conditions, and a smoothed (adaptive-field) closure with a fixed length restores numerical stability and convergence over the tested conditions (Sections III-B and V-A).</w:t>
       </w:r>
     </w:p>
     <w:p>
@@ -4390,7 +4390,7 @@
         <w:rPr>
           <w:sz w:val="20"/>
         </w:rPr>
-        <w:t xml:space="preserve"> (a) Ψ′ = F(1 + d ln F/d ln Λ), so Ψ increases if and only if d ln F/d ln Λ &gt; −1. (b) If Ψ is increasing with supremum Ψ</w:t>
+        <w:t xml:space="preserve"> (a) Ψ′ = F(1 + d ln F/d ln Λ), so Ψ is strictly increasing if d ln F/d ln Λ ≥ −1 everywhere with equality at most at isolated points (Ψ′ may vanish at isolated points without creating a fold), and has a fold where d ln F/d ln Λ &lt; −1 on an interval. (b) If Ψ is strictly increasing with supremum Ψ</w:t>
       </w:r>
       <w:r>
         <w:rPr>
@@ -4657,7 +4657,7 @@
         <w:rPr>
           <w:sz w:val="20"/>
         </w:rPr>
-        <w:t>/m, i.e. Θ = 1/2 for m = 2). F = f + (1 − f)/(1 + Λ²) is admissible iff f &gt; 1/9. F = f + (1 − f)exp(−αΛ²) is admissible iff f &gt; 2e</w:t>
+        <w:t>/m, i.e., Θ = 1/2 for m = 2). F = f + (1 − f)/(1 + Λ²) is admissible (Ψ′ &gt; 0) iff f &gt; 1/9; at f = 1/9, Ψ′ has one isolated zero and Ψ stays strictly increasing, so the boundary case has no fold but a vertical tangent. F = f + (1 − f)exp(−αΛ²) is admissible (Ψ′ &gt; 0) iff f &gt; 2e</w:t>
       </w:r>
       <w:r>
         <w:rPr>
@@ -4683,7 +4683,7 @@
         <w:rPr>
           <w:sz w:val="20"/>
         </w:rPr>
-        <w:t>) = 0.3086, for any α. Proofs are in the supplement. This is the condition under which a nonlinear diffusion problem with a drive-dependent flux is well posed [13], and part (c) is the rotation analog of the S-curve of L–H models [8], [9].</w:t>
+        <w:t>) = 0.3086, for any α, with the same degenerate boundary. Proofs are in the supplement and Table II summarizes the conditions. This is the condition under which a nonlinear diffusion problem with a drive-dependent flux is well posed [13], and part (c) is the rotation analog of the S-curve of L–H models [8], [9].</w:t>
       </w:r>
     </w:p>
     <w:p>
@@ -5510,7 +5510,7 @@
         <w:rPr>
           <w:sz w:val="20"/>
         </w:rPr>
-        <w:t xml:space="preserve"> by continuation; linear stability is read from the eigenvalues of the Jacobian of dT/dt. The rotation equation is solved by scaled Newton iteration with torque continuation, and torque ramps by backward-Euler marching so that the dynamics select the branch. Details are in the supplement.</w:t>
+        <w:t xml:space="preserve"> by continuation; linear stability is read from the eigenvalues of the Jacobian of dT/dt. The rotation equation is solved by scaled Newton iteration with torque continuation, and torque ramps by backward-Euler marching so that the dynamics select the branch. The verification checks are listed in Table III, and details are in the supplement.</w:t>
       </w:r>
     </w:p>
     <w:p>
@@ -6038,7 +6038,7 @@
         <w:rPr>
           <w:i/>
         </w:rPr>
-        <w:t>The Local Closure Is Numerically Ill Posed</w:t>
+        <w:t>Local Closure: Numerical Instability and Edge Sensitivity</w:t>
       </w:r>
     </w:p>
     <w:p>
@@ -7695,7 +7695,7 @@
         <w:rPr>
           <w:sz w:val="20"/>
         </w:rPr>
-        <w:t xml:space="preserve"> ≥ 0.2), i.e. ΔQ/Q = 0.056%/s</w:t>
+        <w:t xml:space="preserve"> ≥ 0.2), i.e., ΔQ/Q = 0.056%/s</w:t>
       </w:r>
       <w:r>
         <w:rPr>
@@ -11017,7 +11017,7 @@
         <w:rPr>
           <w:sz w:val="20"/>
         </w:rPr>
-        <w:t xml:space="preserve"> ≳ 0.3, i.e. growth rates above 0.3c</w:t>
+        <w:t xml:space="preserve"> ≳ 0.3, i.e., growth rates above 0.3c</w:t>
       </w:r>
       <w:r>
         <w:rPr>
@@ -11056,7 +11056,7 @@
         <w:rPr>
           <w:sz w:val="20"/>
         </w:rPr>
-        <w:t xml:space="preserve"> ≲ 0.07. Which regime applies cannot be decided without gyrokinetic growth rates for the profiles in question, and that calibration, together with ℓ, is the main open step. Meanwhile the fitted relation ΔQ/Q = 0.056%/s</w:t>
+        <w:t xml:space="preserve"> ≲ 0.07. Which regime applies cannot be decided without gyrokinetic growth rates for the profiles in question, and that calibration, together with ℓ, is the main open step (Table VIII collects the calibration results). Meanwhile the fitted relation ΔQ/Q = 0.056%/s</w:t>
       </w:r>
       <w:r>
         <w:rPr>
@@ -12601,7 +12601,7 @@
         <w:rPr>
           <w:sz w:val="20"/>
         </w:rPr>
-        <w:t>At P</w:t>
+        <w:t>Two separate calculations are reported. (i) At the fixed reference heating P</w:t>
       </w:r>
       <w:r>
         <w:rPr>
@@ -12614,7 +12614,7 @@
         <w:rPr>
           <w:sz w:val="20"/>
         </w:rPr>
-        <w:t xml:space="preserve"> = 40 MW the baseline gives P</w:t>
+        <w:t xml:space="preserve"> = 40 MW, the baseline gives P</w:t>
       </w:r>
       <w:r>
         <w:rPr>
@@ -12640,20 +12640,59 @@
         <w:rPr>
           <w:sz w:val="20"/>
         </w:rPr>
-        <w:t xml:space="preserve"> = -45 MW (Table IX): engineering breakeven would need a physical gain of Q = 6.14 instead of 3.70. The net power is negative for all 256 sampled assumptions (5–95%: -92 to -17 MW), and when P</w:t>
+        <w:t xml:space="preserve"> = -45 MW at the central assumptions (Table IX); engineering breakeven would need a physical gain of Q = 6.14 instead of 3.70, and P</w:t>
       </w:r>
       <w:r>
         <w:rPr>
           <w:sz w:val="20"/>
           <w:vertAlign w:val="subscript"/>
         </w:rPr>
+        <w:t>net</w:t>
+      </w:r>
+      <w:r>
+        <w:rPr>
+          <w:sz w:val="20"/>
+        </w:rPr>
+        <w:t xml:space="preserve"> is negative for all 256 sampled assumptions (5–95%: -92 to -17 MW). (ii) Separately, at the central assumptions, lowering P</w:t>
+      </w:r>
+      <w:r>
+        <w:rPr>
+          <w:sz w:val="20"/>
+          <w:vertAlign w:val="subscript"/>
+        </w:rPr>
         <w:t>aux</w:t>
       </w:r>
       <w:r>
         <w:rPr>
           <w:sz w:val="20"/>
         </w:rPr>
-        <w:t xml:space="preserve"> is reduced it rises monotonically to -8 MW at the lowest value scanned (10 MW), so the plasma of this model is below engineering breakeven under every assumption tried except the most favorable corner at low heating power (best over the power scan: positive for 18% of draws). The closure raises P</w:t>
+        <w:t xml:space="preserve"> raises P</w:t>
+      </w:r>
+      <w:r>
+        <w:rPr>
+          <w:sz w:val="20"/>
+          <w:vertAlign w:val="subscript"/>
+        </w:rPr>
+        <w:t>net</w:t>
+      </w:r>
+      <w:r>
+        <w:rPr>
+          <w:sz w:val="20"/>
+        </w:rPr>
+        <w:t xml:space="preserve"> monotonically to -8 MW at the lowest value scanned (10 MW); and if each sampled draw is evaluated at the scanned heating power that is best for it, P</w:t>
+      </w:r>
+      <w:r>
+        <w:rPr>
+          <w:sz w:val="20"/>
+          <w:vertAlign w:val="subscript"/>
+        </w:rPr>
+        <w:t>net</w:t>
+      </w:r>
+      <w:r>
+        <w:rPr>
+          <w:sz w:val="20"/>
+        </w:rPr>
+        <w:t xml:space="preserve"> becomes positive for 18% of the draws, which are the most favorable combinations of efficiencies at low heating power. The plasma of this model is therefore below engineering breakeven at 40 MW under every assumption sampled, and at lower heating power except in that favorable corner. The closure raises P</w:t>
       </w:r>
       <w:r>
         <w:rPr>
@@ -12858,7 +12897,7 @@
         <w:rPr>
           <w:sz w:val="20"/>
         </w:rPr>
-        <w:t>The limitations are those of a reduced model: no existence, uniqueness, or continuous-dependence theorem is proved for the nonlinear heat problem, so “ill posed” and “well behaved” rest on numerical evidence over the tested conditions; one-dimensional energy transport with fixed density, equal temperatures, and local alpha deposition; one-way coupling to rotation; no pedestal, edge-localized-mode, or magnetohydrodynamic physics; generic critical-gradient parameters (benchmarked only at the level of Section VI); an uncalibrated threshold and length; and no experimental data. The plasma current, elongation, and the Troyon limit enter only the calibration. A predictive claim would require gyrokinetic calibration of s</w:t>
+        <w:t>The limitations are those of a reduced model: no existence, uniqueness, or continuous-dependence theorem is proved for the nonlinear heat problem, so the instability of the local closure and the “well behaved” behavior of the smoothed closure rest on numerical evidence over the tested conditions, and mathematical ill-posedness of the local closure is not proved; one-dimensional energy transport with fixed density, equal temperatures, and local alpha deposition; one-way coupling to rotation; no pedestal, edge-localized-mode, or magnetohydrodynamic physics; generic critical-gradient parameters (benchmarked only at the level of Section VI); an uncalibrated threshold and length; and no experimental data. The plasma current, elongation, and the Troyon limit enter only the calibration. A predictive claim would require gyrokinetic calibration of s</w:t>
       </w:r>
       <w:r>
         <w:rPr>
@@ -13006,7 +13045,7 @@
         <w:rPr>
           <w:sz w:val="20"/>
         </w:rPr>
-        <w:t>² with a documented uncertainty, while the local closure is numerically ill posed and its answers depend on the edge treatment. The admissibility conditions are exact and tested to ten digits. The baseline is L-mode-like (H</w:t>
+        <w:t>² with a documented uncertainty, while the local closure showed numerical instability at fine resolution and answers that depend on the edge treatment under the tested conditions. The admissibility conditions are exact and tested to ten digits. The baseline is L-mode-like (H</w:t>
       </w:r>
       <w:r>
         <w:rPr>
@@ -13071,7 +13110,7 @@
         <w:rPr>
           <w:sz w:val="20"/>
         </w:rPr>
-        <w:t>All code, tests, raw results (results.json), figure scripts, and the manuscript builders are at https://github.com/sandlerleon/tokamak-statedependent-closure (release v1.2.0) and archived at https://doi.org/10.5281/zenodo.23268573 (software, MIT license); this manuscript is archived as a preprint at https://doi.org/10.5281/zenodo.23268576. No experimental data were used. A supplementary file contains the proofs, the numerical protocol, and extended tables.</w:t>
+        <w:t>All code, tests, raw results (results.json), figure scripts, and the manuscript builders are at https://github.com/sandlerleon/tokamak-statedependent-closure (release v1.2.1) and archived at https://doi.org/10.5281/zenodo.23282919 (software, MIT license); this manuscript is archived as a preprint at https://doi.org/10.5281/zenodo.23282928. No experimental data were used. A supplementary file contains the proofs, the numerical protocol, and extended tables.</w:t>
       </w:r>
     </w:p>
     <w:p>

</xml_diff>